<commit_message>
Mejoras en tracking v4
</commit_message>
<xml_diff>
--- a/novahub-frontend/documentos-novahub/Guia_Usuario_Logistica_NovaERP.docx
+++ b/novahub-frontend/documentos-novahub/Guia_Usuario_Logistica_NovaERP.docx
@@ -4,19 +4,18 @@
   <w:body>
     <w:p>
       <w:pPr>
-        <w:rPr>
-          <w:rFonts w:asciiTheme="majorHAnsi" w:eastAsiaTheme="majorEastAsia" w:hAnsiTheme="majorHAnsi" w:cstheme="majorBidi"/>
-          <w:color w:val="0F4761" w:themeColor="accent1" w:themeShade="BF"/>
+        <w:outlineLvl w:val="0"/>
+        <w:rPr>
+          <w:b/>
+          <w:color w:val="16A34A"/>
           <w:sz w:val="40"/>
-          <w:szCs w:val="40"/>
         </w:rPr>
       </w:pPr>
       <w:r>
         <w:rPr>
-          <w:rFonts w:asciiTheme="majorHAnsi" w:eastAsiaTheme="majorEastAsia" w:hAnsiTheme="majorHAnsi" w:cstheme="majorBidi"/>
-          <w:color w:val="0F4761" w:themeColor="accent1" w:themeShade="BF"/>
+          <w:b/>
+          <w:color w:val="16A34A"/>
           <w:sz w:val="40"/>
-          <w:szCs w:val="40"/>
         </w:rPr>
         <w:t>Guía del módulo Tracking (importaciones)</w:t>
       </w:r>
@@ -28,19 +27,18 @@
     </w:p>
     <w:p>
       <w:pPr>
-        <w:rPr>
-          <w:rFonts w:asciiTheme="majorHAnsi" w:eastAsiaTheme="majorEastAsia" w:hAnsiTheme="majorHAnsi" w:cstheme="majorBidi"/>
-          <w:color w:val="0F4761" w:themeColor="accent1" w:themeShade="BF"/>
-          <w:sz w:val="32"/>
-          <w:szCs w:val="32"/>
+        <w:outlineLvl w:val="1"/>
+        <w:rPr>
+          <w:b/>
+          <w:color w:val="16A34A"/>
+          <w:sz w:val="28"/>
         </w:rPr>
       </w:pPr>
       <w:r>
         <w:rPr>
-          <w:rFonts w:asciiTheme="majorHAnsi" w:eastAsiaTheme="majorEastAsia" w:hAnsiTheme="majorHAnsi" w:cstheme="majorBidi"/>
-          <w:color w:val="0F4761" w:themeColor="accent1" w:themeShade="BF"/>
-          <w:sz w:val="32"/>
-          <w:szCs w:val="32"/>
+          <w:b/>
+          <w:color w:val="16A34A"/>
+          <w:sz w:val="28"/>
         </w:rPr>
         <w:t>1. Para qué sirve este módulo</w:t>
       </w:r>
@@ -51,167 +49,101 @@
       </w:r>
     </w:p>
     <w:p>
+      <w:r>
+        <w:t>• Ves el viaje del paquete (¿dónde está? ¿en aduana? ¿en reparto?).</w:t>
+      </w:r>
+    </w:p>
+    <w:p>
+      <w:r>
+        <w:t>• Registras el paquete cuando llega a tu bodega.</w:t>
+      </w:r>
+    </w:p>
+    <w:p>
+      <w:r>
+        <w:t>• Lo facturas a tu cliente (le cobras por libra).</w:t>
+      </w:r>
+    </w:p>
+    <w:p>
+      <w:r>
+        <w:t>• Le das a tu cliente un enlace para que él mismo vea el estado de su paquete.</w:t>
+      </w:r>
+    </w:p>
+    <w:p>
       <w:pPr>
-        <w:rPr>
-          <w:rFonts w:asciiTheme="majorHAnsi" w:eastAsiaTheme="majorEastAsia" w:hAnsiTheme="majorHAnsi" w:cstheme="majorBidi"/>
-          <w:b/>
-          <w:bCs/>
-          <w:sz w:val="24"/>
-          <w:szCs w:val="24"/>
+        <w:outlineLvl w:val="1"/>
+        <w:rPr>
+          <w:b/>
+          <w:color w:val="16A34A"/>
+          <w:sz w:val="28"/>
         </w:rPr>
       </w:pPr>
       <w:r>
         <w:rPr>
-          <w:rFonts w:asciiTheme="majorHAnsi" w:eastAsiaTheme="majorEastAsia" w:hAnsiTheme="majorHAnsi" w:cstheme="majorBidi"/>
-          <w:b/>
-          <w:bCs/>
-          <w:sz w:val="24"/>
-          <w:szCs w:val="24"/>
-        </w:rPr>
-        <w:t>Ves el viaje del paquete (¿dónde está? ¿en aduana? ¿en reparto?).</w:t>
+          <w:b/>
+          <w:color w:val="16A34A"/>
+          <w:sz w:val="28"/>
+        </w:rPr>
+        <w:t>2. Antes de empezar</w:t>
+      </w:r>
+    </w:p>
+    <w:p>
+      <w:r>
+        <w:t xml:space="preserve">• Entra al sistema y pulsa el módulo </w:t>
+      </w:r>
+      <w:r>
+        <w:rPr>
+          <w:b/>
+        </w:rPr>
+        <w:t>Tracking</w:t>
+      </w:r>
+      <w:r>
+        <w:t xml:space="preserve"> en el menú lateral.</w:t>
+      </w:r>
+    </w:p>
+    <w:p>
+      <w:r>
+        <w:t>• Si alguna pantalla te dice que no tienes permiso (error 403), pídele al administrador que active el permiso en Configuración &gt; Roles y permisos. [CAPTURA 1: menú lateral con Tracking]</w:t>
       </w:r>
     </w:p>
     <w:p>
       <w:pPr>
-        <w:rPr>
-          <w:rFonts w:asciiTheme="majorHAnsi" w:eastAsiaTheme="majorEastAsia" w:hAnsiTheme="majorHAnsi" w:cstheme="majorBidi"/>
-          <w:b/>
-          <w:bCs/>
-          <w:sz w:val="24"/>
-          <w:szCs w:val="24"/>
+        <w:outlineLvl w:val="1"/>
+        <w:rPr>
+          <w:b/>
+          <w:color w:val="16A34A"/>
+          <w:sz w:val="28"/>
         </w:rPr>
       </w:pPr>
       <w:r>
         <w:rPr>
-          <w:rFonts w:asciiTheme="majorHAnsi" w:eastAsiaTheme="majorEastAsia" w:hAnsiTheme="majorHAnsi" w:cstheme="majorBidi"/>
-          <w:b/>
-          <w:bCs/>
-          <w:sz w:val="24"/>
-          <w:szCs w:val="24"/>
-        </w:rPr>
-        <w:t>Registras el paquete cuando llega a tu bodega.</w:t>
+          <w:b/>
+          <w:color w:val="16A34A"/>
+          <w:sz w:val="28"/>
+        </w:rPr>
+        <w:t>3. El tutorial paso a paso (botón ?)</w:t>
+      </w:r>
+    </w:p>
+    <w:p>
+      <w:r>
+        <w:t>Cada pestaña del módulo tiene un botón con un signo de interrogación (?) arriba a la derecha, junto a las pestañas. Al pulsarlo se abre una guía paso a paso que te va señalando en la pantalla qué hacer: primero el buscador, luego el botón para guardar, etc. Es la forma más rápida de aprender cada sección mientras la ves funcionando. [CAPTURA 2: tutorial abierto señalando un botón]</w:t>
       </w:r>
     </w:p>
     <w:p>
       <w:pPr>
-        <w:rPr>
-          <w:rFonts w:asciiTheme="majorHAnsi" w:eastAsiaTheme="majorEastAsia" w:hAnsiTheme="majorHAnsi" w:cstheme="majorBidi"/>
-          <w:b/>
-          <w:bCs/>
-          <w:sz w:val="24"/>
-          <w:szCs w:val="24"/>
+        <w:outlineLvl w:val="1"/>
+        <w:rPr>
+          <w:b/>
+          <w:color w:val="16A34A"/>
+          <w:sz w:val="28"/>
         </w:rPr>
       </w:pPr>
       <w:r>
         <w:rPr>
-          <w:rFonts w:asciiTheme="majorHAnsi" w:eastAsiaTheme="majorEastAsia" w:hAnsiTheme="majorHAnsi" w:cstheme="majorBidi"/>
-          <w:b/>
-          <w:bCs/>
-          <w:sz w:val="24"/>
-          <w:szCs w:val="24"/>
-        </w:rPr>
-        <w:t>Lo facturas a tu cliente (le cobras por libra).</w:t>
-      </w:r>
-    </w:p>
-    <w:p>
-      <w:pPr>
-        <w:rPr>
-          <w:rFonts w:asciiTheme="majorHAnsi" w:eastAsiaTheme="majorEastAsia" w:hAnsiTheme="majorHAnsi" w:cstheme="majorBidi"/>
-          <w:b/>
-          <w:bCs/>
-          <w:sz w:val="24"/>
-          <w:szCs w:val="24"/>
-        </w:rPr>
-      </w:pPr>
-      <w:r>
-        <w:rPr>
-          <w:rFonts w:asciiTheme="majorHAnsi" w:eastAsiaTheme="majorEastAsia" w:hAnsiTheme="majorHAnsi" w:cstheme="majorBidi"/>
-          <w:b/>
-          <w:bCs/>
-          <w:sz w:val="24"/>
-          <w:szCs w:val="24"/>
-        </w:rPr>
-        <w:t>Le das a tu cliente un enlace para que él mismo vea el estado de su paquete.</w:t>
-      </w:r>
-    </w:p>
-    <w:p>
-      <w:pPr>
-        <w:rPr>
-          <w:rFonts w:asciiTheme="majorHAnsi" w:eastAsiaTheme="majorEastAsia" w:hAnsiTheme="majorHAnsi" w:cstheme="majorBidi"/>
-          <w:color w:val="0F4761" w:themeColor="accent1" w:themeShade="BF"/>
-          <w:sz w:val="32"/>
-          <w:szCs w:val="32"/>
-        </w:rPr>
-      </w:pPr>
-      <w:r>
-        <w:rPr>
-          <w:rFonts w:asciiTheme="majorHAnsi" w:eastAsiaTheme="majorEastAsia" w:hAnsiTheme="majorHAnsi" w:cstheme="majorBidi"/>
-          <w:color w:val="0F4761" w:themeColor="accent1" w:themeShade="BF"/>
-          <w:sz w:val="32"/>
-          <w:szCs w:val="32"/>
-        </w:rPr>
-        <w:t>2. Antes de empezar</w:t>
-      </w:r>
-    </w:p>
-    <w:p>
-      <w:pPr>
-        <w:rPr>
-          <w:rFonts w:asciiTheme="majorHAnsi" w:eastAsiaTheme="majorEastAsia" w:hAnsiTheme="majorHAnsi" w:cstheme="majorBidi"/>
-          <w:b/>
-          <w:bCs/>
-          <w:sz w:val="24"/>
-          <w:szCs w:val="24"/>
-        </w:rPr>
-      </w:pPr>
-      <w:r>
-        <w:rPr>
-          <w:rFonts w:asciiTheme="majorHAnsi" w:eastAsiaTheme="majorEastAsia" w:hAnsiTheme="majorHAnsi" w:cstheme="majorBidi"/>
-          <w:b/>
-          <w:bCs/>
-          <w:sz w:val="24"/>
-          <w:szCs w:val="24"/>
-        </w:rPr>
-        <w:t>Entra al sistema y pulsa el módulo **Tracking** en el menú lateral.</w:t>
-      </w:r>
-    </w:p>
-    <w:p>
-      <w:pPr>
-        <w:rPr>
-          <w:rFonts w:asciiTheme="majorHAnsi" w:eastAsiaTheme="majorEastAsia" w:hAnsiTheme="majorHAnsi" w:cstheme="majorBidi"/>
-          <w:b/>
-          <w:bCs/>
-          <w:sz w:val="24"/>
-          <w:szCs w:val="24"/>
-        </w:rPr>
-      </w:pPr>
-      <w:r>
-        <w:rPr>
-          <w:rFonts w:asciiTheme="majorHAnsi" w:eastAsiaTheme="majorEastAsia" w:hAnsiTheme="majorHAnsi" w:cstheme="majorBidi"/>
-          <w:b/>
-          <w:bCs/>
-          <w:sz w:val="24"/>
-          <w:szCs w:val="24"/>
-        </w:rPr>
-        <w:t>Si alguna pantalla te dice que no tienes permiso (error 403), pídele al administrador que active el permiso en Configuración &gt; Roles y permisos. [CAPTURA 1: menú lateral con Tracking]</w:t>
-      </w:r>
-    </w:p>
-    <w:p>
-      <w:pPr>
-        <w:rPr>
-          <w:rFonts w:asciiTheme="majorHAnsi" w:eastAsiaTheme="majorEastAsia" w:hAnsiTheme="majorHAnsi" w:cstheme="majorBidi"/>
-          <w:color w:val="0F4761" w:themeColor="accent1" w:themeShade="BF"/>
-          <w:sz w:val="32"/>
-          <w:szCs w:val="32"/>
-        </w:rPr>
-      </w:pPr>
-      <w:r>
-        <w:rPr>
-          <w:rFonts w:asciiTheme="majorHAnsi" w:eastAsiaTheme="majorEastAsia" w:hAnsiTheme="majorHAnsi" w:cstheme="majorBidi"/>
-          <w:color w:val="0F4761" w:themeColor="accent1" w:themeShade="BF"/>
-          <w:sz w:val="32"/>
-          <w:szCs w:val="32"/>
-        </w:rPr>
-        <w:t>3. Las pestañas de un vistazo</w:t>
+          <w:b/>
+          <w:color w:val="16A34A"/>
+          <w:sz w:val="28"/>
+        </w:rPr>
+        <w:t>4. Las pestañas de un vistazo</w:t>
       </w:r>
     </w:p>
     <w:p>
@@ -253,7 +185,15 @@
             <w:tcW w:w="4419" w:type="dxa"/>
           </w:tcPr>
           <w:p>
-            <w:r>
+            <w:pPr>
+              <w:rPr>
+                <w:b/>
+              </w:rPr>
+            </w:pPr>
+            <w:r>
+              <w:rPr>
+                <w:b/>
+              </w:rPr>
               <w:t>Pestaña</w:t>
             </w:r>
           </w:p>
@@ -263,7 +203,15 @@
             <w:tcW w:w="4419" w:type="dxa"/>
           </w:tcPr>
           <w:p>
-            <w:r>
+            <w:pPr>
+              <w:rPr>
+                <w:b/>
+              </w:rPr>
+            </w:pPr>
+            <w:r>
+              <w:rPr>
+                <w:b/>
+              </w:rPr>
               <w:t>¿Para qué sirve?</w:t>
             </w:r>
           </w:p>
@@ -366,6 +314,7 @@
           </w:tcPr>
           <w:p>
             <w:r>
+              <w:lastRenderedPageBreak/>
               <w:t>Conciliación de compras</w:t>
             </w:r>
           </w:p>
@@ -450,7 +399,6 @@
           </w:tcPr>
           <w:p>
             <w:r>
-              <w:lastRenderedPageBreak/>
               <w:t>Facturación y reversiones</w:t>
             </w:r>
           </w:p>
@@ -470,21 +418,20 @@
     <w:p/>
     <w:p>
       <w:pPr>
-        <w:rPr>
-          <w:rFonts w:asciiTheme="majorHAnsi" w:eastAsiaTheme="majorEastAsia" w:hAnsiTheme="majorHAnsi" w:cstheme="majorBidi"/>
-          <w:color w:val="0F4761" w:themeColor="accent1" w:themeShade="BF"/>
-          <w:sz w:val="32"/>
-          <w:szCs w:val="32"/>
+        <w:outlineLvl w:val="1"/>
+        <w:rPr>
+          <w:b/>
+          <w:color w:val="16A34A"/>
+          <w:sz w:val="28"/>
         </w:rPr>
       </w:pPr>
       <w:r>
         <w:rPr>
-          <w:rFonts w:asciiTheme="majorHAnsi" w:eastAsiaTheme="majorEastAsia" w:hAnsiTheme="majorHAnsi" w:cstheme="majorBidi"/>
-          <w:color w:val="0F4761" w:themeColor="accent1" w:themeShade="BF"/>
-          <w:sz w:val="32"/>
-          <w:szCs w:val="32"/>
-        </w:rPr>
-        <w:t>4. Pestaña: En tránsito (seguir un paquete en camino)</w:t>
+          <w:b/>
+          <w:color w:val="16A34A"/>
+          <w:sz w:val="28"/>
+        </w:rPr>
+        <w:t>5. Pestaña: En tránsito (seguir un paquete en camino)</w:t>
       </w:r>
     </w:p>
     <w:p>
@@ -493,1199 +440,833 @@
       </w:r>
     </w:p>
     <w:p>
+      <w:r>
+        <w:t xml:space="preserve">• 1. Escribe el </w:t>
+      </w:r>
+      <w:r>
+        <w:rPr>
+          <w:b/>
+        </w:rPr>
+        <w:t>código de tracking</w:t>
+      </w:r>
+      <w:r>
+        <w:t xml:space="preserve"> (el número que trae el paquete, ej. GFUS01065222301697) en el buscador.</w:t>
+      </w:r>
+    </w:p>
+    <w:p>
+      <w:r>
+        <w:t xml:space="preserve">• 2. Pulsa </w:t>
+      </w:r>
+      <w:r>
+        <w:rPr>
+          <w:b/>
+        </w:rPr>
+        <w:t>Consultar</w:t>
+      </w:r>
+      <w:r>
+        <w:t>.</w:t>
+      </w:r>
+    </w:p>
+    <w:p>
+      <w:r>
+        <w:t>• 3. El sistema pregunta al transportista (AWBOX o CargoTrack) y te muestra: dónde está, hacia dónde va, la fecha estimada y la lista de eventos (recibido, en aduana, en reparto...).</w:t>
+      </w:r>
+    </w:p>
+    <w:p>
+      <w:r>
+        <w:t>• Si el código no aparece, te lo dice con un mensaje claro (ver sección 14).</w:t>
+      </w:r>
+    </w:p>
+    <w:p>
+      <w:r>
+        <w:t xml:space="preserve">• </w:t>
+      </w:r>
+      <w:r>
+        <w:rPr>
+          <w:b/>
+        </w:rPr>
+        <w:t>Nuevo ticket</w:t>
+      </w:r>
+      <w:r>
+        <w:t>: si tu cliente te da el código y el transportista aún no lo tiene, puedes registrar el envío a mano (código, transportista, cliente, origen, destino y fecha estimada). El sistema le asigna un número de ticket (TKT-XXXXXXXX).</w:t>
+      </w:r>
+    </w:p>
+    <w:p>
+      <w:r>
+        <w:t xml:space="preserve">• </w:t>
+      </w:r>
+      <w:r>
+        <w:rPr>
+          <w:b/>
+        </w:rPr>
+        <w:t>Copiar enlace público</w:t>
+      </w:r>
+      <w:r>
+        <w:t>: pulsa este botón y el sistema copia un enlace. Se lo envías a tu cliente por WhatsApp o correo: él lo abre y ve el estado de su paquete sin necesidad de entrar al sistema (ver sección 12). [CAPTURA 2: consulta de un paquete con su recorrido]</w:t>
+      </w:r>
+    </w:p>
+    <w:p>
       <w:pPr>
-        <w:rPr>
-          <w:rFonts w:asciiTheme="majorHAnsi" w:eastAsiaTheme="majorEastAsia" w:hAnsiTheme="majorHAnsi" w:cstheme="majorBidi"/>
-          <w:b/>
-          <w:bCs/>
-          <w:sz w:val="24"/>
-          <w:szCs w:val="24"/>
+        <w:outlineLvl w:val="1"/>
+        <w:rPr>
+          <w:b/>
+          <w:color w:val="16A34A"/>
+          <w:sz w:val="28"/>
         </w:rPr>
       </w:pPr>
       <w:r>
         <w:rPr>
-          <w:rFonts w:asciiTheme="majorHAnsi" w:eastAsiaTheme="majorEastAsia" w:hAnsiTheme="majorHAnsi" w:cstheme="majorBidi"/>
-          <w:b/>
-          <w:bCs/>
-          <w:sz w:val="24"/>
-          <w:szCs w:val="24"/>
-        </w:rPr>
-        <w:t>1. Escribe el **código de tracking** (el número que trae el paquete, ej. GFUS01065222301697) en el buscador.</w:t>
+          <w:b/>
+          <w:color w:val="16A34A"/>
+          <w:sz w:val="28"/>
+        </w:rPr>
+        <w:t>6. Pestaña: Recepción de paquetes (registrar que llegó)</w:t>
+      </w:r>
+    </w:p>
+    <w:p>
+      <w:r>
+        <w:t>Cuando el paquete llega a tu bodega, lo registras aquí. El asistente tiene 4 pasos:</w:t>
+      </w:r>
+    </w:p>
+    <w:p>
+      <w:r>
+        <w:t xml:space="preserve">• </w:t>
+      </w:r>
+      <w:r>
+        <w:rPr>
+          <w:b/>
+        </w:rPr>
+        <w:t>Paso 1 - Tipo y sucursal</w:t>
+      </w:r>
+      <w:r>
+        <w:t>: eliges el tipo de envío (Aéreo, Marítimo, Courier) y la sucursal. El tipo se configura en la pestaña Configuración (ver sección 9).</w:t>
+      </w:r>
+    </w:p>
+    <w:p>
+      <w:r>
+        <w:t xml:space="preserve">• </w:t>
+      </w:r>
+      <w:r>
+        <w:rPr>
+          <w:b/>
+        </w:rPr>
+        <w:t>Paso 2 - Peso</w:t>
+      </w:r>
+      <w:r>
+        <w:t>: escribes cuánto pesa el paquete (en libras). Si no sabes el peso, el sistema puede calcularlo después; lo importante es el peso facturable porque es lo que le cobras al cliente.</w:t>
+      </w:r>
+    </w:p>
+    <w:p>
+      <w:r>
+        <w:t xml:space="preserve">• </w:t>
+      </w:r>
+      <w:r>
+        <w:rPr>
+          <w:b/>
+        </w:rPr>
+        <w:t>Paso 3 - Identificación</w:t>
+      </w:r>
+      <w:r>
+        <w:t>: aquí va el código de tracking. Puedes escanearlo o escribirlo a mano.</w:t>
+      </w:r>
+    </w:p>
+    <w:p>
+      <w:r>
+        <w:t xml:space="preserve">• </w:t>
+      </w:r>
+      <w:r>
+        <w:rPr>
+          <w:b/>
+        </w:rPr>
+        <w:t>Paso 4 - Propietario y bodega</w:t>
+      </w:r>
+      <w:r>
+        <w:t>: indicas de qué cliente es el paquete y a qué bodega va.</w:t>
+      </w:r>
+    </w:p>
+    <w:p>
+      <w:r>
+        <w:lastRenderedPageBreak/>
+        <w:t xml:space="preserve">• Pulsa </w:t>
+      </w:r>
+      <w:r>
+        <w:rPr>
+          <w:b/>
+        </w:rPr>
+        <w:t>Guardar</w:t>
+      </w:r>
+      <w:r>
+        <w:t xml:space="preserve"> y el paquete queda registrado. Si ese código ya estaba registrado, el sistema te lo avisa y no lo duplica. [CAPTURA 3: asistente de recepción]</w:t>
+      </w:r>
+    </w:p>
+    <w:p>
+      <w:r>
+        <w:t>También tienes dos botones para agilizar:</w:t>
+      </w:r>
+    </w:p>
+    <w:p>
+      <w:r>
+        <w:t xml:space="preserve">• </w:t>
+      </w:r>
+      <w:r>
+        <w:rPr>
+          <w:b/>
+        </w:rPr>
+        <w:t>Recepción rápida</w:t>
+      </w:r>
+      <w:r>
+        <w:t>: registras varios paquetes a la vez en una tabla (código, peso, tarifas). Útil cuando llegan muchos.</w:t>
+      </w:r>
+    </w:p>
+    <w:p>
+      <w:r>
+        <w:t xml:space="preserve">• </w:t>
+      </w:r>
+      <w:r>
+        <w:rPr>
+          <w:b/>
+        </w:rPr>
+        <w:t>Importar Excel</w:t>
+      </w:r>
+      <w:r>
+        <w:t>: subes un archivo con todos los paquetes y el sistema los revisa antes de guardar (te marca los que están bien y los que tienen problemas). [CAPTURA 4: importación de Excel con filas marcadas]</w:t>
       </w:r>
     </w:p>
     <w:p>
       <w:pPr>
-        <w:rPr>
-          <w:rFonts w:asciiTheme="majorHAnsi" w:eastAsiaTheme="majorEastAsia" w:hAnsiTheme="majorHAnsi" w:cstheme="majorBidi"/>
-          <w:b/>
-          <w:bCs/>
-          <w:sz w:val="24"/>
-          <w:szCs w:val="24"/>
+        <w:outlineLvl w:val="1"/>
+        <w:rPr>
+          <w:b/>
+          <w:color w:val="16A34A"/>
+          <w:sz w:val="28"/>
         </w:rPr>
       </w:pPr>
       <w:r>
         <w:rPr>
-          <w:rFonts w:asciiTheme="majorHAnsi" w:eastAsiaTheme="majorEastAsia" w:hAnsiTheme="majorHAnsi" w:cstheme="majorBidi"/>
-          <w:b/>
-          <w:bCs/>
-          <w:sz w:val="24"/>
-          <w:szCs w:val="24"/>
-        </w:rPr>
-        <w:t>2. Pulsa **Consultar**.</w:t>
+          <w:b/>
+          <w:color w:val="16A34A"/>
+          <w:sz w:val="28"/>
+        </w:rPr>
+        <w:t>7. Pestaña: Paquetes recibidos (lo que tienes en bodega)</w:t>
+      </w:r>
+    </w:p>
+    <w:p>
+      <w:r>
+        <w:t>• Es la lista de todos los paquetes que has registrado.</w:t>
+      </w:r>
+    </w:p>
+    <w:p>
+      <w:r>
+        <w:t>• Arriba ves los números importantes: total de paquetes, libras aéreas, libras marítimas, pendientes de compra y disponibles para facturar.</w:t>
+      </w:r>
+    </w:p>
+    <w:p>
+      <w:r>
+        <w:t xml:space="preserve">• </w:t>
+      </w:r>
+      <w:r>
+        <w:rPr>
+          <w:b/>
+        </w:rPr>
+        <w:t>Buscar</w:t>
+      </w:r>
+      <w:r>
+        <w:t>: escribe tracking, cliente o bodega para encontrar un paquete.</w:t>
+      </w:r>
+    </w:p>
+    <w:p>
+      <w:r>
+        <w:t xml:space="preserve">• </w:t>
+      </w:r>
+      <w:r>
+        <w:rPr>
+          <w:b/>
+        </w:rPr>
+        <w:t>Ver</w:t>
+      </w:r>
+      <w:r>
+        <w:t xml:space="preserve"> (botón en cada fila): abre el detalle del paquete; ahí puedes corregir tarifas, cambiar bodega o marcarlo como entregado.</w:t>
+      </w:r>
+    </w:p>
+    <w:p>
+      <w:r>
+        <w:t>• Cada paquete muestra su estado en español: Disponible, Facturado, Entregado, etc. [CAPTURA 5: lista de paquetes con sus números arriba]</w:t>
       </w:r>
     </w:p>
     <w:p>
       <w:pPr>
-        <w:rPr>
-          <w:rFonts w:asciiTheme="majorHAnsi" w:eastAsiaTheme="majorEastAsia" w:hAnsiTheme="majorHAnsi" w:cstheme="majorBidi"/>
-          <w:b/>
-          <w:bCs/>
-          <w:sz w:val="24"/>
-          <w:szCs w:val="24"/>
+        <w:outlineLvl w:val="1"/>
+        <w:rPr>
+          <w:b/>
+          <w:color w:val="16A34A"/>
+          <w:sz w:val="28"/>
         </w:rPr>
       </w:pPr>
       <w:r>
         <w:rPr>
-          <w:rFonts w:asciiTheme="majorHAnsi" w:eastAsiaTheme="majorEastAsia" w:hAnsiTheme="majorHAnsi" w:cstheme="majorBidi"/>
-          <w:b/>
-          <w:bCs/>
-          <w:sz w:val="24"/>
-          <w:szCs w:val="24"/>
-        </w:rPr>
-        <w:t>3. El sistema pregunta al transportista (AWBOX o CargoTrack) y te muestra: dónde está, hacia dónde va, la fecha estimada y la lista de eventos (recibido, en aduana, en reparto...).</w:t>
+          <w:b/>
+          <w:color w:val="16A34A"/>
+          <w:sz w:val="28"/>
+        </w:rPr>
+        <w:t>8. Pestaña: Conciliación de compras (unir paquetes con la compra al proveedor)</w:t>
+      </w:r>
+    </w:p>
+    <w:p>
+      <w:r>
+        <w:t>¿Qué es esto? Cuando la mercancía se compra al proveedor, el paquete tiene un costo (lo que pagaste) y un precio de venta (lo que le cobras al cliente). Esta pestaña une los paquetes con esa compra y genera la factura del proveedor.</w:t>
+      </w:r>
+    </w:p>
+    <w:p>
+      <w:r>
+        <w:t>Paso a paso:</w:t>
+      </w:r>
+    </w:p>
+    <w:p>
+      <w:r>
+        <w:t xml:space="preserve">• 1. Elige el </w:t>
+      </w:r>
+      <w:r>
+        <w:rPr>
+          <w:b/>
+        </w:rPr>
+        <w:t>proveedor</w:t>
+      </w:r>
+      <w:r>
+        <w:t>.</w:t>
+      </w:r>
+    </w:p>
+    <w:p>
+      <w:r>
+        <w:t xml:space="preserve">• 2. Elige la </w:t>
+      </w:r>
+      <w:r>
+        <w:rPr>
+          <w:b/>
+        </w:rPr>
+        <w:t>orden de compra (OC)</w:t>
+      </w:r>
+      <w:r>
+        <w:t xml:space="preserve">. Si no existe, créala con el botón correspondiente (proveedor + detalle) y luego pulsa </w:t>
+      </w:r>
+      <w:r>
+        <w:rPr>
+          <w:b/>
+        </w:rPr>
+        <w:t>Aprobar</w:t>
+      </w:r>
+      <w:r>
+        <w:t>.</w:t>
+      </w:r>
+    </w:p>
+    <w:p>
+      <w:r>
+        <w:t>• 3. Marca los paquetes que pertenecen a esa compra.</w:t>
+      </w:r>
+    </w:p>
+    <w:p>
+      <w:r>
+        <w:t xml:space="preserve">• 4. Pulsa </w:t>
+      </w:r>
+      <w:r>
+        <w:rPr>
+          <w:b/>
+        </w:rPr>
+        <w:t>Previsualizar factura</w:t>
+      </w:r>
+      <w:r>
+        <w:t>: ves el total antes de emitir.</w:t>
+      </w:r>
+    </w:p>
+    <w:p>
+      <w:r>
+        <w:t xml:space="preserve">• 5. Pulsa </w:t>
+      </w:r>
+      <w:r>
+        <w:rPr>
+          <w:b/>
+        </w:rPr>
+        <w:t>Confirmar factura</w:t>
+      </w:r>
+      <w:r>
+        <w:t>: queda emitida y los paquetes quedan vinculados a esa compra.</w:t>
+      </w:r>
+    </w:p>
+    <w:p>
+      <w:r>
+        <w:t>Consejo: el número de factura debe ser único por empresa. Si ya usaste ese número, el sistema te avisa para que pongas otro. [CAPTURA 6: pantalla de conciliación con la previsualización]</w:t>
       </w:r>
     </w:p>
     <w:p>
       <w:pPr>
-        <w:rPr>
-          <w:rFonts w:asciiTheme="majorHAnsi" w:eastAsiaTheme="majorEastAsia" w:hAnsiTheme="majorHAnsi" w:cstheme="majorBidi"/>
-          <w:b/>
-          <w:bCs/>
-          <w:sz w:val="24"/>
-          <w:szCs w:val="24"/>
+        <w:outlineLvl w:val="1"/>
+        <w:rPr>
+          <w:b/>
+          <w:color w:val="16A34A"/>
+          <w:sz w:val="28"/>
         </w:rPr>
       </w:pPr>
       <w:r>
         <w:rPr>
-          <w:rFonts w:asciiTheme="majorHAnsi" w:eastAsiaTheme="majorEastAsia" w:hAnsiTheme="majorHAnsi" w:cstheme="majorBidi"/>
-          <w:b/>
-          <w:bCs/>
-          <w:sz w:val="24"/>
-          <w:szCs w:val="24"/>
-        </w:rPr>
-        <w:t>Si el código no aparece, te lo dice con un mensaje claro (ver sección 11).</w:t>
+          <w:b/>
+          <w:color w:val="16A34A"/>
+          <w:sz w:val="28"/>
+        </w:rPr>
+        <w:lastRenderedPageBreak/>
+        <w:t>9. Pestaña: Configuración (los ajustes de tu agencia)</w:t>
+      </w:r>
+    </w:p>
+    <w:p>
+      <w:r>
+        <w:t>Aquí se ajustan los datos que usan las demás pestañas. Tiene 5 botones arriba:</w:t>
+      </w:r>
+    </w:p>
+    <w:p>
+      <w:r>
+        <w:t xml:space="preserve">• </w:t>
+      </w:r>
+      <w:r>
+        <w:rPr>
+          <w:b/>
+        </w:rPr>
+        <w:t>Reglas de peso</w:t>
+      </w:r>
+      <w:r>
+        <w:t>: el peso mínimo que cobras, el redondeo (ej. 1.13 sube a 1.20) y la unidad por defecto (libras, kilos...).</w:t>
+      </w:r>
+    </w:p>
+    <w:p>
+      <w:r>
+        <w:t xml:space="preserve">• </w:t>
+      </w:r>
+      <w:r>
+        <w:rPr>
+          <w:b/>
+        </w:rPr>
+        <w:t>Bodegas / País</w:t>
+      </w:r>
+      <w:r>
+        <w:t xml:space="preserve">: creas tus bodegas (ej. Bodega Managua - Nicaragua). Pones país, nombre y proveedor, y pulsas </w:t>
+      </w:r>
+      <w:r>
+        <w:rPr>
+          <w:b/>
+        </w:rPr>
+        <w:t>Agregar</w:t>
+      </w:r>
+      <w:r>
+        <w:t>.</w:t>
+      </w:r>
+    </w:p>
+    <w:p>
+      <w:r>
+        <w:t xml:space="preserve">• </w:t>
+      </w:r>
+      <w:r>
+        <w:rPr>
+          <w:b/>
+        </w:rPr>
+        <w:t>Tipos de envío</w:t>
+      </w:r>
+      <w:r>
+        <w:t>: aquí se agregan los tipos que aparecen en Recepción. Ver el detalle abajo.</w:t>
+      </w:r>
+    </w:p>
+    <w:p>
+      <w:r>
+        <w:t xml:space="preserve">• </w:t>
+      </w:r>
+      <w:r>
+        <w:rPr>
+          <w:b/>
+        </w:rPr>
+        <w:t>Prefijos</w:t>
+      </w:r>
+      <w:r>
+        <w:t>: reglas para generar códigos y tickets automáticos.</w:t>
+      </w:r>
+    </w:p>
+    <w:p>
+      <w:r>
+        <w:t xml:space="preserve">• </w:t>
+      </w:r>
+      <w:r>
+        <w:rPr>
+          <w:b/>
+        </w:rPr>
+        <w:t>Campos personalizados</w:t>
+      </w:r>
+      <w:r>
+        <w:t>: campos extra que quieras pedir al recibir (ej. observaciones).</w:t>
+      </w:r>
+    </w:p>
+    <w:p>
+      <w:r>
+        <w:rPr>
+          <w:b/>
+        </w:rPr>
+        <w:t>¿Por qué solo me sale Aéreo en Recepción?</w:t>
+      </w:r>
+      <w:r>
+        <w:t xml:space="preserve"> Porque los tipos de envío se agregan aquí. Para agregar Marítimo o Courier:</w:t>
+      </w:r>
+    </w:p>
+    <w:p>
+      <w:r>
+        <w:t xml:space="preserve">• 1. Pulsa la pestaña </w:t>
+      </w:r>
+      <w:r>
+        <w:rPr>
+          <w:b/>
+        </w:rPr>
+        <w:t>Configuración</w:t>
+      </w:r>
+      <w:r>
+        <w:t xml:space="preserve"> del módulo Tracking.</w:t>
+      </w:r>
+    </w:p>
+    <w:p>
+      <w:r>
+        <w:t xml:space="preserve">• 2. Pulsa el botón </w:t>
+      </w:r>
+      <w:r>
+        <w:rPr>
+          <w:b/>
+        </w:rPr>
+        <w:t>Tipos de envío</w:t>
+      </w:r>
+      <w:r>
+        <w:t>.</w:t>
+      </w:r>
+    </w:p>
+    <w:p>
+      <w:r>
+        <w:t xml:space="preserve">• 3. En </w:t>
+      </w:r>
+      <w:r>
+        <w:rPr>
+          <w:b/>
+        </w:rPr>
+        <w:t>Código</w:t>
+      </w:r>
+      <w:r>
+        <w:t xml:space="preserve"> escribe MARITIMO (o COURIER) y en </w:t>
+      </w:r>
+      <w:r>
+        <w:rPr>
+          <w:b/>
+        </w:rPr>
+        <w:t>Nombre</w:t>
+      </w:r>
+      <w:r>
+        <w:t xml:space="preserve"> escribe Marítimo (o Courier).</w:t>
+      </w:r>
+    </w:p>
+    <w:p>
+      <w:r>
+        <w:t xml:space="preserve">• 4. Pulsa el botón </w:t>
+      </w:r>
+      <w:r>
+        <w:rPr>
+          <w:b/>
+        </w:rPr>
+        <w:t>+</w:t>
+      </w:r>
+      <w:r>
+        <w:t xml:space="preserve"> para guardar.</w:t>
+      </w:r>
+    </w:p>
+    <w:p>
+      <w:r>
+        <w:t xml:space="preserve">• 5. Ve a </w:t>
+      </w:r>
+      <w:r>
+        <w:rPr>
+          <w:b/>
+        </w:rPr>
+        <w:t>Recepción de paquetes</w:t>
+      </w:r>
+      <w:r>
+        <w:t xml:space="preserve"> y ya verás Aéreo, Marítimo y Courier en la lista.</w:t>
+      </w:r>
+    </w:p>
+    <w:p>
+      <w:r>
+        <w:t>Nota: tu empresa ya tiene configurados Aéreo, Marítimo y Courier; los verás directamente. Si quieres otro tipo (ej. Terrestre), agrégalo con estos pasos. [CAPTURA 7: Configuración &gt; Tipos de envío]</w:t>
       </w:r>
     </w:p>
     <w:p>
       <w:pPr>
-        <w:rPr>
-          <w:rFonts w:asciiTheme="majorHAnsi" w:eastAsiaTheme="majorEastAsia" w:hAnsiTheme="majorHAnsi" w:cstheme="majorBidi"/>
-          <w:b/>
-          <w:bCs/>
-          <w:sz w:val="24"/>
-          <w:szCs w:val="24"/>
+        <w:outlineLvl w:val="1"/>
+        <w:rPr>
+          <w:b/>
+          <w:color w:val="16A34A"/>
+          <w:sz w:val="28"/>
         </w:rPr>
       </w:pPr>
       <w:r>
         <w:rPr>
-          <w:rFonts w:asciiTheme="majorHAnsi" w:eastAsiaTheme="majorEastAsia" w:hAnsiTheme="majorHAnsi" w:cstheme="majorBidi"/>
-          <w:b/>
-          <w:bCs/>
-          <w:sz w:val="24"/>
-          <w:szCs w:val="24"/>
-        </w:rPr>
-        <w:t>**Nuevo ticket**: si tu cliente te da el código y el transportista aún no lo tiene, puedes registrar el envío a mano (código, transportista, cliente, origen, destino y fecha estimada). El sistema le asigna un número de ticket (TKT-XXXXXXXX).</w:t>
+          <w:b/>
+          <w:color w:val="16A34A"/>
+          <w:sz w:val="28"/>
+        </w:rPr>
+        <w:t>10. Pestaña: Disponibles para facturar (cobrarle al cliente)</w:t>
+      </w:r>
+    </w:p>
+    <w:p>
+      <w:r>
+        <w:t>Cuando el paquete ya está en bodega y con costo, lo facturas aquí. La tarifa por libra es lo que le cobras al cliente por cada libra de su paquete.</w:t>
+      </w:r>
+    </w:p>
+    <w:p>
+      <w:r>
+        <w:t>Paso a paso:</w:t>
+      </w:r>
+    </w:p>
+    <w:p>
+      <w:r>
+        <w:t>• 1. Marca con la casilla los paquetes que vas a cobrar (pueden ser varios).</w:t>
+      </w:r>
+    </w:p>
+    <w:p>
+      <w:r>
+        <w:t xml:space="preserve">• 2. Escribe el </w:t>
+      </w:r>
+      <w:r>
+        <w:rPr>
+          <w:b/>
+        </w:rPr>
+        <w:t>cliente</w:t>
+      </w:r>
+      <w:r>
+        <w:t xml:space="preserve">, la </w:t>
+      </w:r>
+      <w:r>
+        <w:rPr>
+          <w:b/>
+        </w:rPr>
+        <w:t>fecha</w:t>
+      </w:r>
+      <w:r>
+        <w:t xml:space="preserve"> y el </w:t>
+      </w:r>
+      <w:r>
+        <w:rPr>
+          <w:b/>
+        </w:rPr>
+        <w:t>vencimiento</w:t>
+      </w:r>
+      <w:r>
+        <w:t>.</w:t>
+      </w:r>
+    </w:p>
+    <w:p>
+      <w:r>
+        <w:t xml:space="preserve">• 3. Escribe la </w:t>
+      </w:r>
+      <w:r>
+        <w:rPr>
+          <w:b/>
+        </w:rPr>
+        <w:t>tarifa por libra</w:t>
+      </w:r>
+      <w:r>
+        <w:t xml:space="preserve"> (ej. 3.50). Hay un botón para aplicar la tarifa del tipo de envío automáticamente.</w:t>
+      </w:r>
+    </w:p>
+    <w:p>
+      <w:r>
+        <w:t xml:space="preserve">• 4. Pulsa </w:t>
+      </w:r>
+      <w:r>
+        <w:rPr>
+          <w:b/>
+        </w:rPr>
+        <w:t>Previsualizar</w:t>
+      </w:r>
+      <w:r>
+        <w:t>: ves el desglose (libras x tarifa = total).</w:t>
+      </w:r>
+    </w:p>
+    <w:p>
+      <w:r>
+        <w:t xml:space="preserve">• 5. Pulsa </w:t>
+      </w:r>
+      <w:r>
+        <w:rPr>
+          <w:b/>
+        </w:rPr>
+        <w:t>Confirmar factura</w:t>
+      </w:r>
+      <w:r>
+        <w:t>: la factura queda creada y el paquete pasa a estado Facturado. El cobro se registra después desde el módulo Ventas.</w:t>
+      </w:r>
+    </w:p>
+    <w:p>
+      <w:r>
+        <w:t xml:space="preserve">• </w:t>
+      </w:r>
+      <w:r>
+        <w:rPr>
+          <w:b/>
+        </w:rPr>
+        <w:t>Entregar paquetes</w:t>
+      </w:r>
+      <w:r>
+        <w:t>: cuando el cliente recoge su paquete, lo marcas como entregado. Un paquete entregado ya no se puede modificar. [CAPTURA 8: factura con el desglose por libras]</w:t>
       </w:r>
     </w:p>
     <w:p>
       <w:pPr>
-        <w:rPr>
-          <w:rFonts w:asciiTheme="majorHAnsi" w:eastAsiaTheme="majorEastAsia" w:hAnsiTheme="majorHAnsi" w:cstheme="majorBidi"/>
-          <w:b/>
-          <w:bCs/>
-          <w:sz w:val="24"/>
-          <w:szCs w:val="24"/>
+        <w:outlineLvl w:val="1"/>
+        <w:rPr>
+          <w:b/>
+          <w:color w:val="16A34A"/>
+          <w:sz w:val="28"/>
         </w:rPr>
       </w:pPr>
       <w:r>
         <w:rPr>
-          <w:rFonts w:asciiTheme="majorHAnsi" w:eastAsiaTheme="majorEastAsia" w:hAnsiTheme="majorHAnsi" w:cstheme="majorBidi"/>
-          <w:b/>
-          <w:bCs/>
-          <w:sz w:val="24"/>
-          <w:szCs w:val="24"/>
-        </w:rPr>
-        <w:t>**Copiar enlace público**: pulsa este botón y el sistema copia un enlace. Se lo envías a tu cliente por WhatsApp o correo: él lo abre y ve el estado de su paquete sin necesidad de entrar al sistema (ver sección 9). [CAPTURA 2: consulta de un paquete con su recorrido]</w:t>
+          <w:b/>
+          <w:color w:val="16A34A"/>
+          <w:sz w:val="28"/>
+        </w:rPr>
+        <w:lastRenderedPageBreak/>
+        <w:t>11. Pestaña: Facturación y reversiones (corregir errores)</w:t>
+      </w:r>
+    </w:p>
+    <w:p>
+      <w:r>
+        <w:t>Aquí ves el historial de las facturas que has hecho y puedes corregirlas si te equivocaste.</w:t>
+      </w:r>
+    </w:p>
+    <w:p>
+      <w:r>
+        <w:t xml:space="preserve">• </w:t>
+      </w:r>
+      <w:r>
+        <w:rPr>
+          <w:b/>
+        </w:rPr>
+        <w:t>Anular / Reversar</w:t>
+      </w:r>
+      <w:r>
+        <w:t>: si la factura salió mal (ej. cobraste de más), pulsas el botón, escribes la razón (ej. Tarifa incorrecta) y confirmas. La factura se anula, el paquete vuelve a Disponible y los asientos contables se deshacen solos.</w:t>
+      </w:r>
+    </w:p>
+    <w:p>
+      <w:r>
+        <w:t xml:space="preserve">• </w:t>
+      </w:r>
+      <w:r>
+        <w:rPr>
+          <w:b/>
+        </w:rPr>
+        <w:t>Corregir y refacturar</w:t>
+      </w:r>
+      <w:r>
+        <w:t>: después de anular, este botón te vuelve a mostrar los paquetes con sus datos para que ajustes la tarifa y factures de nuevo. La factura nueva queda marcada como reemplazo de la anterior.</w:t>
+      </w:r>
+    </w:p>
+    <w:p>
+      <w:r>
+        <w:t xml:space="preserve">• </w:t>
+      </w:r>
+      <w:r>
+        <w:rPr>
+          <w:b/>
+        </w:rPr>
+        <w:t>Nota de crédito</w:t>
+      </w:r>
+      <w:r>
+        <w:t>: es para casos especiales del módulo Ventas (requiere productos y límite de crédito). Para tu día a día, usa Anular + Corregir y refacturar.</w:t>
+      </w:r>
+    </w:p>
+    <w:p>
+      <w:r>
+        <w:t xml:space="preserve">• Cada factura tiene su </w:t>
+      </w:r>
+      <w:r>
+        <w:rPr>
+          <w:b/>
+        </w:rPr>
+        <w:t>auditoría</w:t>
+      </w:r>
+      <w:r>
+        <w:t>: quién la hizo, quién la anuló y el historial del paquete. [CAPTURA 9: auditoría de una factura anulada y refacturada]</w:t>
       </w:r>
     </w:p>
     <w:p>
       <w:pPr>
-        <w:rPr>
-          <w:rFonts w:asciiTheme="majorHAnsi" w:eastAsiaTheme="majorEastAsia" w:hAnsiTheme="majorHAnsi" w:cstheme="majorBidi"/>
-          <w:color w:val="0F4761" w:themeColor="accent1" w:themeShade="BF"/>
-          <w:sz w:val="32"/>
-          <w:szCs w:val="32"/>
+        <w:outlineLvl w:val="1"/>
+        <w:rPr>
+          <w:b/>
+          <w:color w:val="16A34A"/>
+          <w:sz w:val="28"/>
         </w:rPr>
       </w:pPr>
       <w:r>
         <w:rPr>
-          <w:rFonts w:asciiTheme="majorHAnsi" w:eastAsiaTheme="majorEastAsia" w:hAnsiTheme="majorHAnsi" w:cstheme="majorBidi"/>
-          <w:color w:val="0F4761" w:themeColor="accent1" w:themeShade="BF"/>
-          <w:sz w:val="32"/>
-          <w:szCs w:val="32"/>
-        </w:rPr>
-        <w:t>5. Pestaña: Recepción de paquetes (registrar que llegó)</w:t>
-      </w:r>
-    </w:p>
-    <w:p>
-      <w:r>
-        <w:t>Cuando el paquete llega a tu bodega, lo registras aquí. El asistente tiene 4 pasos:</w:t>
+          <w:b/>
+          <w:color w:val="16A34A"/>
+          <w:sz w:val="28"/>
+        </w:rPr>
+        <w:t>12. El enlace que le mandas a tu cliente</w:t>
+      </w:r>
+    </w:p>
+    <w:p>
+      <w:r>
+        <w:t xml:space="preserve">• En la pestaña </w:t>
+      </w:r>
+      <w:r>
+        <w:rPr>
+          <w:b/>
+        </w:rPr>
+        <w:t>En tránsito</w:t>
+      </w:r>
+      <w:r>
+        <w:t xml:space="preserve">, abre un paquete y pulsa </w:t>
+      </w:r>
+      <w:r>
+        <w:rPr>
+          <w:b/>
+        </w:rPr>
+        <w:t>Copiar enlace público</w:t>
+      </w:r>
+      <w:r>
+        <w:t>.</w:t>
+      </w:r>
+    </w:p>
+    <w:p>
+      <w:r>
+        <w:t>• El sistema copia un enlace tipo: http://tu-servidor/public/tracking/CODIGO</w:t>
+      </w:r>
+    </w:p>
+    <w:p>
+      <w:r>
+        <w:t>• Se lo envías a tu cliente (WhatsApp, correo). Él lo abre sin necesidad de usuario ni contraseña y ve el estado de su paquete y su recorrido.</w:t>
+      </w:r>
+    </w:p>
+    <w:p>
+      <w:r>
+        <w:t>• Si el paquete ya llegó, también verá su estado (Disponible, Facturado, Entregado). [CAPTURA 10: vista que ve tu cliente]</w:t>
       </w:r>
     </w:p>
     <w:p>
       <w:pPr>
-        <w:rPr>
-          <w:rFonts w:asciiTheme="majorHAnsi" w:eastAsiaTheme="majorEastAsia" w:hAnsiTheme="majorHAnsi" w:cstheme="majorBidi"/>
-          <w:b/>
-          <w:bCs/>
-          <w:sz w:val="24"/>
-          <w:szCs w:val="24"/>
+        <w:outlineLvl w:val="1"/>
+        <w:rPr>
+          <w:b/>
+          <w:color w:val="16A34A"/>
+          <w:sz w:val="28"/>
         </w:rPr>
       </w:pPr>
       <w:r>
         <w:rPr>
-          <w:rFonts w:asciiTheme="majorHAnsi" w:eastAsiaTheme="majorEastAsia" w:hAnsiTheme="majorHAnsi" w:cstheme="majorBidi"/>
-          <w:b/>
-          <w:bCs/>
-          <w:sz w:val="24"/>
-          <w:szCs w:val="24"/>
-        </w:rPr>
-        <w:t>**Paso 1 - Tipo y sucursal**: eliges el tipo de envío (Aéreo, Marítimo, Courier) y la sucursal. El tipo se configura en la pestaña Configuración (ver sección 8).</w:t>
-      </w:r>
-    </w:p>
-    <w:p>
-      <w:pPr>
-        <w:rPr>
-          <w:rFonts w:asciiTheme="majorHAnsi" w:eastAsiaTheme="majorEastAsia" w:hAnsiTheme="majorHAnsi" w:cstheme="majorBidi"/>
-          <w:b/>
-          <w:bCs/>
-          <w:sz w:val="24"/>
-          <w:szCs w:val="24"/>
-        </w:rPr>
-      </w:pPr>
-      <w:r>
-        <w:rPr>
-          <w:rFonts w:asciiTheme="majorHAnsi" w:eastAsiaTheme="majorEastAsia" w:hAnsiTheme="majorHAnsi" w:cstheme="majorBidi"/>
-          <w:b/>
-          <w:bCs/>
-          <w:sz w:val="24"/>
-          <w:szCs w:val="24"/>
-        </w:rPr>
-        <w:t>**Paso 2 - Peso**: escribes cuánto pesa el paquete (en libras). Si no sabes el peso, el sistema puede calcularlo después; lo importante es el peso facturable porque es lo que le cobras al cliente.</w:t>
-      </w:r>
-    </w:p>
-    <w:p>
-      <w:pPr>
-        <w:rPr>
-          <w:rFonts w:asciiTheme="majorHAnsi" w:eastAsiaTheme="majorEastAsia" w:hAnsiTheme="majorHAnsi" w:cstheme="majorBidi"/>
-          <w:b/>
-          <w:bCs/>
-          <w:sz w:val="24"/>
-          <w:szCs w:val="24"/>
-        </w:rPr>
-      </w:pPr>
-      <w:r>
-        <w:rPr>
-          <w:rFonts w:asciiTheme="majorHAnsi" w:eastAsiaTheme="majorEastAsia" w:hAnsiTheme="majorHAnsi" w:cstheme="majorBidi"/>
-          <w:b/>
-          <w:bCs/>
-          <w:sz w:val="24"/>
-          <w:szCs w:val="24"/>
-        </w:rPr>
-        <w:t>**Paso 3 - Identificación**: aquí va el código de tracking. Puedes escanearlo o escribirlo a mano.</w:t>
-      </w:r>
-    </w:p>
-    <w:p>
-      <w:pPr>
-        <w:rPr>
-          <w:rFonts w:asciiTheme="majorHAnsi" w:eastAsiaTheme="majorEastAsia" w:hAnsiTheme="majorHAnsi" w:cstheme="majorBidi"/>
-          <w:b/>
-          <w:bCs/>
-          <w:sz w:val="24"/>
-          <w:szCs w:val="24"/>
-        </w:rPr>
-      </w:pPr>
-      <w:r>
-        <w:rPr>
-          <w:rFonts w:asciiTheme="majorHAnsi" w:eastAsiaTheme="majorEastAsia" w:hAnsiTheme="majorHAnsi" w:cstheme="majorBidi"/>
-          <w:b/>
-          <w:bCs/>
-          <w:sz w:val="24"/>
-          <w:szCs w:val="24"/>
-        </w:rPr>
-        <w:t>**Paso 4 - Propietario y bodega**: indicas de qué cliente es el paquete y a qué bodega va.</w:t>
-      </w:r>
-    </w:p>
-    <w:p>
-      <w:pPr>
-        <w:rPr>
-          <w:rFonts w:asciiTheme="majorHAnsi" w:eastAsiaTheme="majorEastAsia" w:hAnsiTheme="majorHAnsi" w:cstheme="majorBidi"/>
-          <w:b/>
-          <w:bCs/>
-          <w:sz w:val="24"/>
-          <w:szCs w:val="24"/>
-        </w:rPr>
-      </w:pPr>
-      <w:r>
-        <w:rPr>
-          <w:rFonts w:asciiTheme="majorHAnsi" w:eastAsiaTheme="majorEastAsia" w:hAnsiTheme="majorHAnsi" w:cstheme="majorBidi"/>
-          <w:b/>
-          <w:bCs/>
-          <w:sz w:val="24"/>
-          <w:szCs w:val="24"/>
-        </w:rPr>
-        <w:t>Pulsa **Guardar** y el paquete queda registrado. Si ese código ya estaba registrado, el sistema te lo avisa y no lo duplica. [CAPTURA 3: asistente de recepción]</w:t>
-      </w:r>
-    </w:p>
-    <w:p>
-      <w:r>
-        <w:t>También tienes dos botones para agilizar:</w:t>
-      </w:r>
-    </w:p>
-    <w:p>
-      <w:pPr>
-        <w:rPr>
-          <w:rFonts w:asciiTheme="majorHAnsi" w:eastAsiaTheme="majorEastAsia" w:hAnsiTheme="majorHAnsi" w:cstheme="majorBidi"/>
-          <w:b/>
-          <w:bCs/>
-          <w:sz w:val="24"/>
-          <w:szCs w:val="24"/>
-        </w:rPr>
-      </w:pPr>
-      <w:r>
-        <w:rPr>
-          <w:rFonts w:asciiTheme="majorHAnsi" w:eastAsiaTheme="majorEastAsia" w:hAnsiTheme="majorHAnsi" w:cstheme="majorBidi"/>
-          <w:b/>
-          <w:bCs/>
-          <w:sz w:val="24"/>
-          <w:szCs w:val="24"/>
-        </w:rPr>
-        <w:lastRenderedPageBreak/>
-        <w:t>**Recepción rápida**: registras varios paquetes a la vez en una tabla (código, peso, tarifas). Útil cuando llegan muchos.</w:t>
-      </w:r>
-    </w:p>
-    <w:p>
-      <w:pPr>
-        <w:rPr>
-          <w:rFonts w:asciiTheme="majorHAnsi" w:eastAsiaTheme="majorEastAsia" w:hAnsiTheme="majorHAnsi" w:cstheme="majorBidi"/>
-          <w:b/>
-          <w:bCs/>
-          <w:sz w:val="24"/>
-          <w:szCs w:val="24"/>
-        </w:rPr>
-      </w:pPr>
-      <w:r>
-        <w:rPr>
-          <w:rFonts w:asciiTheme="majorHAnsi" w:eastAsiaTheme="majorEastAsia" w:hAnsiTheme="majorHAnsi" w:cstheme="majorBidi"/>
-          <w:b/>
-          <w:bCs/>
-          <w:sz w:val="24"/>
-          <w:szCs w:val="24"/>
-        </w:rPr>
-        <w:t>**Importar Excel**: subes un archivo con todos los paquetes y el sistema los revisa antes de guardar (te marca los que están bien y los que tienen problemas). [CAPTURA 4: importación de Excel con filas marcadas]</w:t>
-      </w:r>
-    </w:p>
-    <w:p>
-      <w:pPr>
-        <w:rPr>
-          <w:rFonts w:asciiTheme="majorHAnsi" w:eastAsiaTheme="majorEastAsia" w:hAnsiTheme="majorHAnsi" w:cstheme="majorBidi"/>
-          <w:color w:val="0F4761" w:themeColor="accent1" w:themeShade="BF"/>
-          <w:sz w:val="32"/>
-          <w:szCs w:val="32"/>
-        </w:rPr>
-      </w:pPr>
-      <w:r>
-        <w:rPr>
-          <w:rFonts w:asciiTheme="majorHAnsi" w:eastAsiaTheme="majorEastAsia" w:hAnsiTheme="majorHAnsi" w:cstheme="majorBidi"/>
-          <w:color w:val="0F4761" w:themeColor="accent1" w:themeShade="BF"/>
-          <w:sz w:val="32"/>
-          <w:szCs w:val="32"/>
-        </w:rPr>
-        <w:t>6. Pestaña: Paquetes recibidos (lo que tienes en bodega)</w:t>
-      </w:r>
-    </w:p>
-    <w:p>
-      <w:pPr>
-        <w:rPr>
-          <w:rFonts w:asciiTheme="majorHAnsi" w:eastAsiaTheme="majorEastAsia" w:hAnsiTheme="majorHAnsi" w:cstheme="majorBidi"/>
-          <w:b/>
-          <w:bCs/>
-          <w:sz w:val="24"/>
-          <w:szCs w:val="24"/>
-        </w:rPr>
-      </w:pPr>
-      <w:r>
-        <w:rPr>
-          <w:rFonts w:asciiTheme="majorHAnsi" w:eastAsiaTheme="majorEastAsia" w:hAnsiTheme="majorHAnsi" w:cstheme="majorBidi"/>
-          <w:b/>
-          <w:bCs/>
-          <w:sz w:val="24"/>
-          <w:szCs w:val="24"/>
-        </w:rPr>
-        <w:t>Es la lista de todos los paquetes que has registrado.</w:t>
-      </w:r>
-    </w:p>
-    <w:p>
-      <w:pPr>
-        <w:rPr>
-          <w:rFonts w:asciiTheme="majorHAnsi" w:eastAsiaTheme="majorEastAsia" w:hAnsiTheme="majorHAnsi" w:cstheme="majorBidi"/>
-          <w:b/>
-          <w:bCs/>
-          <w:sz w:val="24"/>
-          <w:szCs w:val="24"/>
-        </w:rPr>
-      </w:pPr>
-      <w:r>
-        <w:rPr>
-          <w:rFonts w:asciiTheme="majorHAnsi" w:eastAsiaTheme="majorEastAsia" w:hAnsiTheme="majorHAnsi" w:cstheme="majorBidi"/>
-          <w:b/>
-          <w:bCs/>
-          <w:sz w:val="24"/>
-          <w:szCs w:val="24"/>
-        </w:rPr>
-        <w:t>Arriba ves los números importantes: total de paquetes, libras aéreas, libras marítimas, pendientes de compra y disponibles para facturar.</w:t>
-      </w:r>
-    </w:p>
-    <w:p>
-      <w:pPr>
-        <w:rPr>
-          <w:rFonts w:asciiTheme="majorHAnsi" w:eastAsiaTheme="majorEastAsia" w:hAnsiTheme="majorHAnsi" w:cstheme="majorBidi"/>
-          <w:b/>
-          <w:bCs/>
-          <w:sz w:val="24"/>
-          <w:szCs w:val="24"/>
-        </w:rPr>
-      </w:pPr>
-      <w:r>
-        <w:rPr>
-          <w:rFonts w:asciiTheme="majorHAnsi" w:eastAsiaTheme="majorEastAsia" w:hAnsiTheme="majorHAnsi" w:cstheme="majorBidi"/>
-          <w:b/>
-          <w:bCs/>
-          <w:sz w:val="24"/>
-          <w:szCs w:val="24"/>
-        </w:rPr>
-        <w:t>**Buscar**: escribe tracking, cliente o bodega para encontrar un paquete.</w:t>
-      </w:r>
-    </w:p>
-    <w:p>
-      <w:pPr>
-        <w:rPr>
-          <w:rFonts w:asciiTheme="majorHAnsi" w:eastAsiaTheme="majorEastAsia" w:hAnsiTheme="majorHAnsi" w:cstheme="majorBidi"/>
-          <w:b/>
-          <w:bCs/>
-          <w:sz w:val="24"/>
-          <w:szCs w:val="24"/>
-        </w:rPr>
-      </w:pPr>
-      <w:r>
-        <w:rPr>
-          <w:rFonts w:asciiTheme="majorHAnsi" w:eastAsiaTheme="majorEastAsia" w:hAnsiTheme="majorHAnsi" w:cstheme="majorBidi"/>
-          <w:b/>
-          <w:bCs/>
-          <w:sz w:val="24"/>
-          <w:szCs w:val="24"/>
-        </w:rPr>
-        <w:t>**Ver** (botón en cada fila): abre el detalle del paquete; ahí puedes corregir tarifas, cambiar bodega o marcarlo como entregado.</w:t>
-      </w:r>
-    </w:p>
-    <w:p>
-      <w:pPr>
-        <w:rPr>
-          <w:rFonts w:asciiTheme="majorHAnsi" w:eastAsiaTheme="majorEastAsia" w:hAnsiTheme="majorHAnsi" w:cstheme="majorBidi"/>
-          <w:b/>
-          <w:bCs/>
-          <w:sz w:val="24"/>
-          <w:szCs w:val="24"/>
-        </w:rPr>
-      </w:pPr>
-      <w:r>
-        <w:rPr>
-          <w:rFonts w:asciiTheme="majorHAnsi" w:eastAsiaTheme="majorEastAsia" w:hAnsiTheme="majorHAnsi" w:cstheme="majorBidi"/>
-          <w:b/>
-          <w:bCs/>
-          <w:sz w:val="24"/>
-          <w:szCs w:val="24"/>
-        </w:rPr>
-        <w:t>Cada paquete muestra su estado en español: Disponible, Facturado, Entregado, etc. [CAPTURA 5: lista de paquetes con sus números arriba]</w:t>
-      </w:r>
-    </w:p>
-    <w:p>
-      <w:pPr>
-        <w:rPr>
-          <w:rFonts w:asciiTheme="majorHAnsi" w:eastAsiaTheme="majorEastAsia" w:hAnsiTheme="majorHAnsi" w:cstheme="majorBidi"/>
-          <w:color w:val="0F4761" w:themeColor="accent1" w:themeShade="BF"/>
-          <w:sz w:val="32"/>
-          <w:szCs w:val="32"/>
-        </w:rPr>
-      </w:pPr>
-      <w:r>
-        <w:rPr>
-          <w:rFonts w:asciiTheme="majorHAnsi" w:eastAsiaTheme="majorEastAsia" w:hAnsiTheme="majorHAnsi" w:cstheme="majorBidi"/>
-          <w:color w:val="0F4761" w:themeColor="accent1" w:themeShade="BF"/>
-          <w:sz w:val="32"/>
-          <w:szCs w:val="32"/>
-        </w:rPr>
-        <w:t>7. Pestaña: Conciliación de compras (unir paquetes con la compra al proveedor)</w:t>
-      </w:r>
-    </w:p>
-    <w:p>
-      <w:r>
-        <w:t>¿Qué es esto? Cuando la mercancía se compra al proveedor, el paquete tiene un costo (lo que pagaste) y un precio de venta (lo que le cobras al cliente). Esta pestaña une los paquetes con esa compra y genera la factura del proveedor.</w:t>
-      </w:r>
-    </w:p>
-    <w:p>
-      <w:r>
-        <w:t>Paso a paso:</w:t>
-      </w:r>
-    </w:p>
-    <w:p>
-      <w:pPr>
-        <w:rPr>
-          <w:rFonts w:asciiTheme="majorHAnsi" w:eastAsiaTheme="majorEastAsia" w:hAnsiTheme="majorHAnsi" w:cstheme="majorBidi"/>
-          <w:b/>
-          <w:bCs/>
-          <w:sz w:val="24"/>
-          <w:szCs w:val="24"/>
-        </w:rPr>
-      </w:pPr>
-      <w:r>
-        <w:rPr>
-          <w:rFonts w:asciiTheme="majorHAnsi" w:eastAsiaTheme="majorEastAsia" w:hAnsiTheme="majorHAnsi" w:cstheme="majorBidi"/>
-          <w:b/>
-          <w:bCs/>
-          <w:sz w:val="24"/>
-          <w:szCs w:val="24"/>
-        </w:rPr>
-        <w:t>1. Elige el **proveedor**.</w:t>
-      </w:r>
-    </w:p>
-    <w:p>
-      <w:pPr>
-        <w:rPr>
-          <w:rFonts w:asciiTheme="majorHAnsi" w:eastAsiaTheme="majorEastAsia" w:hAnsiTheme="majorHAnsi" w:cstheme="majorBidi"/>
-          <w:b/>
-          <w:bCs/>
-          <w:sz w:val="24"/>
-          <w:szCs w:val="24"/>
-        </w:rPr>
-      </w:pPr>
-      <w:r>
-        <w:rPr>
-          <w:rFonts w:asciiTheme="majorHAnsi" w:eastAsiaTheme="majorEastAsia" w:hAnsiTheme="majorHAnsi" w:cstheme="majorBidi"/>
-          <w:b/>
-          <w:bCs/>
-          <w:sz w:val="24"/>
-          <w:szCs w:val="24"/>
-        </w:rPr>
-        <w:t>2. Elige la **orden de compra (OC)**. Si no existe, créala con el botón correspondiente (proveedor + detalle) y luego pulsa **Aprobar**.</w:t>
-      </w:r>
-    </w:p>
-    <w:p>
-      <w:pPr>
-        <w:rPr>
-          <w:rFonts w:asciiTheme="majorHAnsi" w:eastAsiaTheme="majorEastAsia" w:hAnsiTheme="majorHAnsi" w:cstheme="majorBidi"/>
-          <w:b/>
-          <w:bCs/>
-          <w:sz w:val="24"/>
-          <w:szCs w:val="24"/>
-        </w:rPr>
-      </w:pPr>
-      <w:r>
-        <w:rPr>
-          <w:rFonts w:asciiTheme="majorHAnsi" w:eastAsiaTheme="majorEastAsia" w:hAnsiTheme="majorHAnsi" w:cstheme="majorBidi"/>
-          <w:b/>
-          <w:bCs/>
-          <w:sz w:val="24"/>
-          <w:szCs w:val="24"/>
-        </w:rPr>
-        <w:t>3. Marca los paquetes que pertenecen a esa compra.</w:t>
-      </w:r>
-    </w:p>
-    <w:p>
-      <w:pPr>
-        <w:rPr>
-          <w:rFonts w:asciiTheme="majorHAnsi" w:eastAsiaTheme="majorEastAsia" w:hAnsiTheme="majorHAnsi" w:cstheme="majorBidi"/>
-          <w:b/>
-          <w:bCs/>
-          <w:sz w:val="24"/>
-          <w:szCs w:val="24"/>
-        </w:rPr>
-      </w:pPr>
-      <w:r>
-        <w:rPr>
-          <w:rFonts w:asciiTheme="majorHAnsi" w:eastAsiaTheme="majorEastAsia" w:hAnsiTheme="majorHAnsi" w:cstheme="majorBidi"/>
-          <w:b/>
-          <w:bCs/>
-          <w:sz w:val="24"/>
-          <w:szCs w:val="24"/>
-        </w:rPr>
-        <w:t>4. Pulsa **Previsualizar factura**: ves el total antes de emitir.</w:t>
-      </w:r>
-    </w:p>
-    <w:p>
-      <w:pPr>
-        <w:rPr>
-          <w:rFonts w:asciiTheme="majorHAnsi" w:eastAsiaTheme="majorEastAsia" w:hAnsiTheme="majorHAnsi" w:cstheme="majorBidi"/>
-          <w:b/>
-          <w:bCs/>
-          <w:sz w:val="24"/>
-          <w:szCs w:val="24"/>
-        </w:rPr>
-      </w:pPr>
-      <w:r>
-        <w:rPr>
-          <w:rFonts w:asciiTheme="majorHAnsi" w:eastAsiaTheme="majorEastAsia" w:hAnsiTheme="majorHAnsi" w:cstheme="majorBidi"/>
-          <w:b/>
-          <w:bCs/>
-          <w:sz w:val="24"/>
-          <w:szCs w:val="24"/>
-        </w:rPr>
-        <w:t>5. Pulsa **Confirmar factura**: queda emitida y los paquetes quedan vinculados a esa compra.</w:t>
-      </w:r>
-    </w:p>
-    <w:p>
-      <w:r>
-        <w:t>Consejo: el número de factura debe ser único por empresa. Si ya usaste ese número, el sistema te avisa para que pongas otro. [CAPTURA 6: pantalla de conciliación con la previsualización]</w:t>
-      </w:r>
-    </w:p>
-    <w:p>
-      <w:pPr>
-        <w:rPr>
-          <w:rFonts w:asciiTheme="majorHAnsi" w:eastAsiaTheme="majorEastAsia" w:hAnsiTheme="majorHAnsi" w:cstheme="majorBidi"/>
-          <w:color w:val="0F4761" w:themeColor="accent1" w:themeShade="BF"/>
-          <w:sz w:val="32"/>
-          <w:szCs w:val="32"/>
-        </w:rPr>
-      </w:pPr>
-      <w:r>
-        <w:rPr>
-          <w:rFonts w:asciiTheme="majorHAnsi" w:eastAsiaTheme="majorEastAsia" w:hAnsiTheme="majorHAnsi" w:cstheme="majorBidi"/>
-          <w:color w:val="0F4761" w:themeColor="accent1" w:themeShade="BF"/>
-          <w:sz w:val="32"/>
-          <w:szCs w:val="32"/>
-        </w:rPr>
-        <w:t>8. Pestaña: Configuración (los ajustes de tu agencia)</w:t>
-      </w:r>
-    </w:p>
-    <w:p>
-      <w:r>
-        <w:lastRenderedPageBreak/>
-        <w:t>Aquí se ajustan los datos que usan las demás pestañas. Tiene 5 botones arriba:</w:t>
-      </w:r>
-    </w:p>
-    <w:p>
-      <w:pPr>
-        <w:rPr>
-          <w:rFonts w:asciiTheme="majorHAnsi" w:eastAsiaTheme="majorEastAsia" w:hAnsiTheme="majorHAnsi" w:cstheme="majorBidi"/>
-          <w:b/>
-          <w:bCs/>
-          <w:sz w:val="24"/>
-          <w:szCs w:val="24"/>
-        </w:rPr>
-      </w:pPr>
-      <w:r>
-        <w:rPr>
-          <w:rFonts w:asciiTheme="majorHAnsi" w:eastAsiaTheme="majorEastAsia" w:hAnsiTheme="majorHAnsi" w:cstheme="majorBidi"/>
-          <w:b/>
-          <w:bCs/>
-          <w:sz w:val="24"/>
-          <w:szCs w:val="24"/>
-        </w:rPr>
-        <w:t>**Reglas de peso**: el peso mínimo que cobras, el redondeo (ej. 1.13 sube a 1.20) y la unidad por defecto (libras, kilos...).</w:t>
-      </w:r>
-    </w:p>
-    <w:p>
-      <w:pPr>
-        <w:rPr>
-          <w:rFonts w:asciiTheme="majorHAnsi" w:eastAsiaTheme="majorEastAsia" w:hAnsiTheme="majorHAnsi" w:cstheme="majorBidi"/>
-          <w:b/>
-          <w:bCs/>
-          <w:sz w:val="24"/>
-          <w:szCs w:val="24"/>
-        </w:rPr>
-      </w:pPr>
-      <w:r>
-        <w:rPr>
-          <w:rFonts w:asciiTheme="majorHAnsi" w:eastAsiaTheme="majorEastAsia" w:hAnsiTheme="majorHAnsi" w:cstheme="majorBidi"/>
-          <w:b/>
-          <w:bCs/>
-          <w:sz w:val="24"/>
-          <w:szCs w:val="24"/>
-        </w:rPr>
-        <w:t>**Bodegas / País**: creas tus bodegas (ej. Bodega Managua - Nicaragua). Pones país, nombre y proveedor, y pulsas **Agregar**.</w:t>
-      </w:r>
-    </w:p>
-    <w:p>
-      <w:pPr>
-        <w:rPr>
-          <w:rFonts w:asciiTheme="majorHAnsi" w:eastAsiaTheme="majorEastAsia" w:hAnsiTheme="majorHAnsi" w:cstheme="majorBidi"/>
-          <w:b/>
-          <w:bCs/>
-          <w:sz w:val="24"/>
-          <w:szCs w:val="24"/>
-        </w:rPr>
-      </w:pPr>
-      <w:r>
-        <w:rPr>
-          <w:rFonts w:asciiTheme="majorHAnsi" w:eastAsiaTheme="majorEastAsia" w:hAnsiTheme="majorHAnsi" w:cstheme="majorBidi"/>
-          <w:b/>
-          <w:bCs/>
-          <w:sz w:val="24"/>
-          <w:szCs w:val="24"/>
-        </w:rPr>
-        <w:t>**Tipos de envío**: aquí se agregan los tipos que aparecen en Recepción. Ver el detalle abajo.</w:t>
-      </w:r>
-    </w:p>
-    <w:p>
-      <w:pPr>
-        <w:rPr>
-          <w:rFonts w:asciiTheme="majorHAnsi" w:eastAsiaTheme="majorEastAsia" w:hAnsiTheme="majorHAnsi" w:cstheme="majorBidi"/>
-          <w:b/>
-          <w:bCs/>
-          <w:sz w:val="24"/>
-          <w:szCs w:val="24"/>
-        </w:rPr>
-      </w:pPr>
-      <w:r>
-        <w:rPr>
-          <w:rFonts w:asciiTheme="majorHAnsi" w:eastAsiaTheme="majorEastAsia" w:hAnsiTheme="majorHAnsi" w:cstheme="majorBidi"/>
-          <w:b/>
-          <w:bCs/>
-          <w:sz w:val="24"/>
-          <w:szCs w:val="24"/>
-        </w:rPr>
-        <w:t>**Prefijos**: reglas para generar códigos y tickets automáticos.</w:t>
-      </w:r>
-    </w:p>
-    <w:p>
-      <w:pPr>
-        <w:rPr>
-          <w:rFonts w:asciiTheme="majorHAnsi" w:eastAsiaTheme="majorEastAsia" w:hAnsiTheme="majorHAnsi" w:cstheme="majorBidi"/>
-          <w:b/>
-          <w:bCs/>
-          <w:sz w:val="24"/>
-          <w:szCs w:val="24"/>
-        </w:rPr>
-      </w:pPr>
-      <w:r>
-        <w:rPr>
-          <w:rFonts w:asciiTheme="majorHAnsi" w:eastAsiaTheme="majorEastAsia" w:hAnsiTheme="majorHAnsi" w:cstheme="majorBidi"/>
-          <w:b/>
-          <w:bCs/>
-          <w:sz w:val="24"/>
-          <w:szCs w:val="24"/>
-        </w:rPr>
-        <w:t>**Campos personalizados**: campos extra que quieras pedir al recibir (ej. observaciones).</w:t>
-      </w:r>
-    </w:p>
-    <w:p>
-      <w:r>
-        <w:t>**¿Por qué solo me sale Aéreo en Recepción?** Porque los tipos de envío se agregan aquí. Para agregar Marítimo o Courier:</w:t>
-      </w:r>
-    </w:p>
-    <w:p>
-      <w:pPr>
-        <w:rPr>
-          <w:rFonts w:asciiTheme="majorHAnsi" w:eastAsiaTheme="majorEastAsia" w:hAnsiTheme="majorHAnsi" w:cstheme="majorBidi"/>
-          <w:b/>
-          <w:bCs/>
-          <w:sz w:val="24"/>
-          <w:szCs w:val="24"/>
-        </w:rPr>
-      </w:pPr>
-      <w:r>
-        <w:rPr>
-          <w:rFonts w:asciiTheme="majorHAnsi" w:eastAsiaTheme="majorEastAsia" w:hAnsiTheme="majorHAnsi" w:cstheme="majorBidi"/>
-          <w:b/>
-          <w:bCs/>
-          <w:sz w:val="24"/>
-          <w:szCs w:val="24"/>
-        </w:rPr>
-        <w:t>1. Pulsa la pestaña **Configuración** del módulo Tracking.</w:t>
-      </w:r>
-    </w:p>
-    <w:p>
-      <w:pPr>
-        <w:rPr>
-          <w:rFonts w:asciiTheme="majorHAnsi" w:eastAsiaTheme="majorEastAsia" w:hAnsiTheme="majorHAnsi" w:cstheme="majorBidi"/>
-          <w:b/>
-          <w:bCs/>
-          <w:sz w:val="24"/>
-          <w:szCs w:val="24"/>
-        </w:rPr>
-      </w:pPr>
-      <w:r>
-        <w:rPr>
-          <w:rFonts w:asciiTheme="majorHAnsi" w:eastAsiaTheme="majorEastAsia" w:hAnsiTheme="majorHAnsi" w:cstheme="majorBidi"/>
-          <w:b/>
-          <w:bCs/>
-          <w:sz w:val="24"/>
-          <w:szCs w:val="24"/>
-        </w:rPr>
-        <w:t>2. Pulsa el botón **Tipos de envío**.</w:t>
-      </w:r>
-    </w:p>
-    <w:p>
-      <w:pPr>
-        <w:rPr>
-          <w:rFonts w:asciiTheme="majorHAnsi" w:eastAsiaTheme="majorEastAsia" w:hAnsiTheme="majorHAnsi" w:cstheme="majorBidi"/>
-          <w:b/>
-          <w:bCs/>
-          <w:sz w:val="24"/>
-          <w:szCs w:val="24"/>
-        </w:rPr>
-      </w:pPr>
-      <w:r>
-        <w:rPr>
-          <w:rFonts w:asciiTheme="majorHAnsi" w:eastAsiaTheme="majorEastAsia" w:hAnsiTheme="majorHAnsi" w:cstheme="majorBidi"/>
-          <w:b/>
-          <w:bCs/>
-          <w:sz w:val="24"/>
-          <w:szCs w:val="24"/>
-        </w:rPr>
-        <w:t>3. En **Código** escribe MARITIMO (o COURIER) y en **Nombre** escribe Marítimo (o Courier).</w:t>
-      </w:r>
-    </w:p>
-    <w:p>
-      <w:pPr>
-        <w:rPr>
-          <w:rFonts w:asciiTheme="majorHAnsi" w:eastAsiaTheme="majorEastAsia" w:hAnsiTheme="majorHAnsi" w:cstheme="majorBidi"/>
-          <w:b/>
-          <w:bCs/>
-          <w:sz w:val="24"/>
-          <w:szCs w:val="24"/>
-        </w:rPr>
-      </w:pPr>
-      <w:r>
-        <w:rPr>
-          <w:rFonts w:asciiTheme="majorHAnsi" w:eastAsiaTheme="majorEastAsia" w:hAnsiTheme="majorHAnsi" w:cstheme="majorBidi"/>
-          <w:b/>
-          <w:bCs/>
-          <w:sz w:val="24"/>
-          <w:szCs w:val="24"/>
-        </w:rPr>
-        <w:t>4. Pulsa el botón **+** para guardar.</w:t>
-      </w:r>
-    </w:p>
-    <w:p>
-      <w:pPr>
-        <w:rPr>
-          <w:rFonts w:asciiTheme="majorHAnsi" w:eastAsiaTheme="majorEastAsia" w:hAnsiTheme="majorHAnsi" w:cstheme="majorBidi"/>
-          <w:b/>
-          <w:bCs/>
-          <w:sz w:val="24"/>
-          <w:szCs w:val="24"/>
-        </w:rPr>
-      </w:pPr>
-      <w:r>
-        <w:rPr>
-          <w:rFonts w:asciiTheme="majorHAnsi" w:eastAsiaTheme="majorEastAsia" w:hAnsiTheme="majorHAnsi" w:cstheme="majorBidi"/>
-          <w:b/>
-          <w:bCs/>
-          <w:sz w:val="24"/>
-          <w:szCs w:val="24"/>
-        </w:rPr>
-        <w:t>5. Ve a **Recepción de paquetes** y ya verás Aéreo, Marítimo y Courier en la lista.</w:t>
-      </w:r>
-    </w:p>
-    <w:p>
-      <w:r>
-        <w:t>Nota: tu empresa ya tiene configurados Aéreo, Marítimo y Courier; los verás directamente. Si quieres otro tipo (ej. Terrestre), agrégalo con estos pasos. [CAPTURA 7: Configuración &gt; Tipos de envío]</w:t>
-      </w:r>
-    </w:p>
-    <w:p>
-      <w:pPr>
-        <w:rPr>
-          <w:rFonts w:asciiTheme="majorHAnsi" w:eastAsiaTheme="majorEastAsia" w:hAnsiTheme="majorHAnsi" w:cstheme="majorBidi"/>
-          <w:color w:val="0F4761" w:themeColor="accent1" w:themeShade="BF"/>
-          <w:sz w:val="32"/>
-          <w:szCs w:val="32"/>
-        </w:rPr>
-      </w:pPr>
-      <w:r>
-        <w:rPr>
-          <w:rFonts w:asciiTheme="majorHAnsi" w:eastAsiaTheme="majorEastAsia" w:hAnsiTheme="majorHAnsi" w:cstheme="majorBidi"/>
-          <w:color w:val="0F4761" w:themeColor="accent1" w:themeShade="BF"/>
-          <w:sz w:val="32"/>
-          <w:szCs w:val="32"/>
-        </w:rPr>
-        <w:t>9. Pestaña: Disponibles para facturar (cobrarle al cliente)</w:t>
-      </w:r>
-    </w:p>
-    <w:p>
-      <w:r>
-        <w:t>Cuando el paquete ya está en bodega y con costo, lo facturas aquí. La tarifa por libra es lo que le cobras al cliente por cada libra de su paquete.</w:t>
-      </w:r>
-    </w:p>
-    <w:p>
-      <w:r>
-        <w:t>Paso a paso:</w:t>
-      </w:r>
-    </w:p>
-    <w:p>
-      <w:pPr>
-        <w:rPr>
-          <w:rFonts w:asciiTheme="majorHAnsi" w:eastAsiaTheme="majorEastAsia" w:hAnsiTheme="majorHAnsi" w:cstheme="majorBidi"/>
-          <w:b/>
-          <w:bCs/>
-          <w:sz w:val="24"/>
-          <w:szCs w:val="24"/>
-        </w:rPr>
-      </w:pPr>
-      <w:r>
-        <w:rPr>
-          <w:rFonts w:asciiTheme="majorHAnsi" w:eastAsiaTheme="majorEastAsia" w:hAnsiTheme="majorHAnsi" w:cstheme="majorBidi"/>
-          <w:b/>
-          <w:bCs/>
-          <w:sz w:val="24"/>
-          <w:szCs w:val="24"/>
-        </w:rPr>
-        <w:t>1. Marca con la casilla los paquetes que vas a cobrar (pueden ser varios).</w:t>
-      </w:r>
-    </w:p>
-    <w:p>
-      <w:pPr>
-        <w:rPr>
-          <w:rFonts w:asciiTheme="majorHAnsi" w:eastAsiaTheme="majorEastAsia" w:hAnsiTheme="majorHAnsi" w:cstheme="majorBidi"/>
-          <w:b/>
-          <w:bCs/>
-          <w:sz w:val="24"/>
-          <w:szCs w:val="24"/>
-        </w:rPr>
-      </w:pPr>
-      <w:r>
-        <w:rPr>
-          <w:rFonts w:asciiTheme="majorHAnsi" w:eastAsiaTheme="majorEastAsia" w:hAnsiTheme="majorHAnsi" w:cstheme="majorBidi"/>
-          <w:b/>
-          <w:bCs/>
-          <w:sz w:val="24"/>
-          <w:szCs w:val="24"/>
-        </w:rPr>
-        <w:t>2. Escribe el **cliente**, la **fecha** y el **vencimiento**.</w:t>
-      </w:r>
-    </w:p>
-    <w:p>
-      <w:pPr>
-        <w:rPr>
-          <w:rFonts w:asciiTheme="majorHAnsi" w:eastAsiaTheme="majorEastAsia" w:hAnsiTheme="majorHAnsi" w:cstheme="majorBidi"/>
-          <w:b/>
-          <w:bCs/>
-          <w:sz w:val="24"/>
-          <w:szCs w:val="24"/>
-        </w:rPr>
-      </w:pPr>
-      <w:r>
-        <w:rPr>
-          <w:rFonts w:asciiTheme="majorHAnsi" w:eastAsiaTheme="majorEastAsia" w:hAnsiTheme="majorHAnsi" w:cstheme="majorBidi"/>
-          <w:b/>
-          <w:bCs/>
-          <w:sz w:val="24"/>
-          <w:szCs w:val="24"/>
-        </w:rPr>
-        <w:t>3. Escribe la **tarifa por libra** (ej. 3.50). Hay un botón para aplicar la tarifa del tipo de envío automáticamente.</w:t>
-      </w:r>
-    </w:p>
-    <w:p>
-      <w:pPr>
-        <w:rPr>
-          <w:rFonts w:asciiTheme="majorHAnsi" w:eastAsiaTheme="majorEastAsia" w:hAnsiTheme="majorHAnsi" w:cstheme="majorBidi"/>
-          <w:b/>
-          <w:bCs/>
-          <w:sz w:val="24"/>
-          <w:szCs w:val="24"/>
-        </w:rPr>
-      </w:pPr>
-      <w:r>
-        <w:rPr>
-          <w:rFonts w:asciiTheme="majorHAnsi" w:eastAsiaTheme="majorEastAsia" w:hAnsiTheme="majorHAnsi" w:cstheme="majorBidi"/>
-          <w:b/>
-          <w:bCs/>
-          <w:sz w:val="24"/>
-          <w:szCs w:val="24"/>
-        </w:rPr>
-        <w:t>4. Pulsa **Previsualizar**: ves el desglose (libras x tarifa = total).</w:t>
-      </w:r>
-    </w:p>
-    <w:p>
-      <w:pPr>
-        <w:rPr>
-          <w:rFonts w:asciiTheme="majorHAnsi" w:eastAsiaTheme="majorEastAsia" w:hAnsiTheme="majorHAnsi" w:cstheme="majorBidi"/>
-          <w:b/>
-          <w:bCs/>
-          <w:sz w:val="24"/>
-          <w:szCs w:val="24"/>
-        </w:rPr>
-      </w:pPr>
-      <w:r>
-        <w:rPr>
-          <w:rFonts w:asciiTheme="majorHAnsi" w:eastAsiaTheme="majorEastAsia" w:hAnsiTheme="majorHAnsi" w:cstheme="majorBidi"/>
-          <w:b/>
-          <w:bCs/>
-          <w:sz w:val="24"/>
-          <w:szCs w:val="24"/>
-        </w:rPr>
-        <w:t>5. Pulsa **Confirmar factura**: la factura queda creada y el paquete pasa a estado Facturado. El cobro se registra después desde el módulo Ventas.</w:t>
-      </w:r>
-    </w:p>
-    <w:p>
-      <w:pPr>
-        <w:rPr>
-          <w:rFonts w:asciiTheme="majorHAnsi" w:eastAsiaTheme="majorEastAsia" w:hAnsiTheme="majorHAnsi" w:cstheme="majorBidi"/>
-          <w:b/>
-          <w:bCs/>
-          <w:sz w:val="24"/>
-          <w:szCs w:val="24"/>
-        </w:rPr>
-      </w:pPr>
-      <w:r>
-        <w:rPr>
-          <w:rFonts w:asciiTheme="majorHAnsi" w:eastAsiaTheme="majorEastAsia" w:hAnsiTheme="majorHAnsi" w:cstheme="majorBidi"/>
-          <w:b/>
-          <w:bCs/>
-          <w:sz w:val="24"/>
-          <w:szCs w:val="24"/>
-        </w:rPr>
-        <w:t>**Entregar paquetes**: cuando el cliente recoge su paquete, lo marcas como entregado. Un paquete entregado ya no se puede modificar. [CAPTURA 8: factura con el desglose por libras]</w:t>
-      </w:r>
-    </w:p>
-    <w:p>
-      <w:pPr>
-        <w:rPr>
-          <w:rFonts w:asciiTheme="majorHAnsi" w:eastAsiaTheme="majorEastAsia" w:hAnsiTheme="majorHAnsi" w:cstheme="majorBidi"/>
-          <w:color w:val="0F4761" w:themeColor="accent1" w:themeShade="BF"/>
-          <w:sz w:val="32"/>
-          <w:szCs w:val="32"/>
-        </w:rPr>
-      </w:pPr>
-      <w:r>
-        <w:rPr>
-          <w:rFonts w:asciiTheme="majorHAnsi" w:eastAsiaTheme="majorEastAsia" w:hAnsiTheme="majorHAnsi" w:cstheme="majorBidi"/>
-          <w:color w:val="0F4761" w:themeColor="accent1" w:themeShade="BF"/>
-          <w:sz w:val="32"/>
-          <w:szCs w:val="32"/>
-        </w:rPr>
-        <w:t>10. Pestaña: Facturación y reversiones (corregir errores)</w:t>
-      </w:r>
-    </w:p>
-    <w:p>
-      <w:r>
-        <w:t>Aquí ves el historial de las facturas que has hecho y puedes corregirlas si te equivocaste.</w:t>
-      </w:r>
-    </w:p>
-    <w:p>
-      <w:pPr>
-        <w:rPr>
-          <w:rFonts w:asciiTheme="majorHAnsi" w:eastAsiaTheme="majorEastAsia" w:hAnsiTheme="majorHAnsi" w:cstheme="majorBidi"/>
-          <w:b/>
-          <w:bCs/>
-          <w:sz w:val="24"/>
-          <w:szCs w:val="24"/>
-        </w:rPr>
-      </w:pPr>
-      <w:r>
-        <w:rPr>
-          <w:rFonts w:asciiTheme="majorHAnsi" w:eastAsiaTheme="majorEastAsia" w:hAnsiTheme="majorHAnsi" w:cstheme="majorBidi"/>
-          <w:b/>
-          <w:bCs/>
-          <w:sz w:val="24"/>
-          <w:szCs w:val="24"/>
-        </w:rPr>
-        <w:t>**Anular / Reversar**: si la factura salió mal (ej. cobraste de más), pulsas el botón, escribes la razón (ej. "Tarifa incorrecta") y confirmas. La factura se anula, el paquete vuelve a Disponible y los asientos contables se deshacen solos.</w:t>
-      </w:r>
-    </w:p>
-    <w:p>
-      <w:pPr>
-        <w:rPr>
-          <w:rFonts w:asciiTheme="majorHAnsi" w:eastAsiaTheme="majorEastAsia" w:hAnsiTheme="majorHAnsi" w:cstheme="majorBidi"/>
-          <w:b/>
-          <w:bCs/>
-          <w:sz w:val="24"/>
-          <w:szCs w:val="24"/>
-        </w:rPr>
-      </w:pPr>
-      <w:r>
-        <w:rPr>
-          <w:rFonts w:asciiTheme="majorHAnsi" w:eastAsiaTheme="majorEastAsia" w:hAnsiTheme="majorHAnsi" w:cstheme="majorBidi"/>
-          <w:b/>
-          <w:bCs/>
-          <w:sz w:val="24"/>
-          <w:szCs w:val="24"/>
-        </w:rPr>
-        <w:t>**Corregir y refacturar**: después de anular, este botón te vuelve a mostrar los paquetes con sus datos para que ajustes la tarifa y factures de nuevo. La factura nueva queda marcada como reemplazo de la anterior.</w:t>
-      </w:r>
-    </w:p>
-    <w:p>
-      <w:pPr>
-        <w:rPr>
-          <w:rFonts w:asciiTheme="majorHAnsi" w:eastAsiaTheme="majorEastAsia" w:hAnsiTheme="majorHAnsi" w:cstheme="majorBidi"/>
-          <w:b/>
-          <w:bCs/>
-          <w:sz w:val="24"/>
-          <w:szCs w:val="24"/>
-        </w:rPr>
-      </w:pPr>
-      <w:r>
-        <w:rPr>
-          <w:rFonts w:asciiTheme="majorHAnsi" w:eastAsiaTheme="majorEastAsia" w:hAnsiTheme="majorHAnsi" w:cstheme="majorBidi"/>
-          <w:b/>
-          <w:bCs/>
-          <w:sz w:val="24"/>
-          <w:szCs w:val="24"/>
-        </w:rPr>
-        <w:t>**Nota de crédito**: es para casos especiales del módulo Ventas (requiere productos y límite de crédito). Para tu día a día, usa Anular + Corregir y refacturar.</w:t>
-      </w:r>
-    </w:p>
-    <w:p>
-      <w:pPr>
-        <w:rPr>
-          <w:rFonts w:asciiTheme="majorHAnsi" w:eastAsiaTheme="majorEastAsia" w:hAnsiTheme="majorHAnsi" w:cstheme="majorBidi"/>
-          <w:b/>
-          <w:bCs/>
-          <w:sz w:val="24"/>
-          <w:szCs w:val="24"/>
-        </w:rPr>
-      </w:pPr>
-      <w:r>
-        <w:rPr>
-          <w:rFonts w:asciiTheme="majorHAnsi" w:eastAsiaTheme="majorEastAsia" w:hAnsiTheme="majorHAnsi" w:cstheme="majorBidi"/>
-          <w:b/>
-          <w:bCs/>
-          <w:sz w:val="24"/>
-          <w:szCs w:val="24"/>
-        </w:rPr>
-        <w:t>Cada factura tiene su **auditoría**: quién la hizo, quién la anuló y el historial del paquete. [CAPTURA 9: auditoría de una factura anulada y refacturada]</w:t>
-      </w:r>
-    </w:p>
-    <w:p>
-      <w:pPr>
-        <w:rPr>
-          <w:rFonts w:asciiTheme="majorHAnsi" w:eastAsiaTheme="majorEastAsia" w:hAnsiTheme="majorHAnsi" w:cstheme="majorBidi"/>
-          <w:color w:val="0F4761" w:themeColor="accent1" w:themeShade="BF"/>
-          <w:sz w:val="32"/>
-          <w:szCs w:val="32"/>
-        </w:rPr>
-      </w:pPr>
-      <w:r>
-        <w:rPr>
-          <w:rFonts w:asciiTheme="majorHAnsi" w:eastAsiaTheme="majorEastAsia" w:hAnsiTheme="majorHAnsi" w:cstheme="majorBidi"/>
-          <w:color w:val="0F4761" w:themeColor="accent1" w:themeShade="BF"/>
-          <w:sz w:val="32"/>
-          <w:szCs w:val="32"/>
-        </w:rPr>
-        <w:t>11. El enlace que le mandas a tu cliente</w:t>
-      </w:r>
-    </w:p>
-    <w:p>
-      <w:pPr>
-        <w:rPr>
-          <w:rFonts w:asciiTheme="majorHAnsi" w:eastAsiaTheme="majorEastAsia" w:hAnsiTheme="majorHAnsi" w:cstheme="majorBidi"/>
-          <w:b/>
-          <w:bCs/>
-          <w:sz w:val="24"/>
-          <w:szCs w:val="24"/>
-        </w:rPr>
-      </w:pPr>
-      <w:r>
-        <w:rPr>
-          <w:rFonts w:asciiTheme="majorHAnsi" w:eastAsiaTheme="majorEastAsia" w:hAnsiTheme="majorHAnsi" w:cstheme="majorBidi"/>
-          <w:b/>
-          <w:bCs/>
-          <w:sz w:val="24"/>
-          <w:szCs w:val="24"/>
-        </w:rPr>
-        <w:t>En la pestaña **En tránsito**, abre un paquete y pulsa **Copiar enlace público**.</w:t>
-      </w:r>
-    </w:p>
-    <w:p>
-      <w:pPr>
-        <w:rPr>
-          <w:rFonts w:asciiTheme="majorHAnsi" w:eastAsiaTheme="majorEastAsia" w:hAnsiTheme="majorHAnsi" w:cstheme="majorBidi"/>
-          <w:b/>
-          <w:bCs/>
-          <w:sz w:val="24"/>
-          <w:szCs w:val="24"/>
-        </w:rPr>
-      </w:pPr>
-      <w:r>
-        <w:rPr>
-          <w:rFonts w:asciiTheme="majorHAnsi" w:eastAsiaTheme="majorEastAsia" w:hAnsiTheme="majorHAnsi" w:cstheme="majorBidi"/>
-          <w:b/>
-          <w:bCs/>
-          <w:sz w:val="24"/>
-          <w:szCs w:val="24"/>
-        </w:rPr>
-        <w:t>El sistema copia un enlace tipo: http://tu-servidor/public/tracking/CODIGO</w:t>
-      </w:r>
-    </w:p>
-    <w:p>
-      <w:pPr>
-        <w:rPr>
-          <w:rFonts w:asciiTheme="majorHAnsi" w:eastAsiaTheme="majorEastAsia" w:hAnsiTheme="majorHAnsi" w:cstheme="majorBidi"/>
-          <w:b/>
-          <w:bCs/>
-          <w:sz w:val="24"/>
-          <w:szCs w:val="24"/>
-        </w:rPr>
-      </w:pPr>
-      <w:r>
-        <w:rPr>
-          <w:rFonts w:asciiTheme="majorHAnsi" w:eastAsiaTheme="majorEastAsia" w:hAnsiTheme="majorHAnsi" w:cstheme="majorBidi"/>
-          <w:b/>
-          <w:bCs/>
-          <w:sz w:val="24"/>
-          <w:szCs w:val="24"/>
-        </w:rPr>
-        <w:t>Se lo envías a tu cliente (WhatsApp, correo). Él lo abre sin necesidad de usuario ni contraseña y ve el estado de su paquete y su recorrido.</w:t>
-      </w:r>
-    </w:p>
-    <w:p>
-      <w:pPr>
-        <w:rPr>
-          <w:rFonts w:asciiTheme="majorHAnsi" w:eastAsiaTheme="majorEastAsia" w:hAnsiTheme="majorHAnsi" w:cstheme="majorBidi"/>
-          <w:b/>
-          <w:bCs/>
-          <w:sz w:val="24"/>
-          <w:szCs w:val="24"/>
-        </w:rPr>
-      </w:pPr>
-      <w:r>
-        <w:rPr>
-          <w:rFonts w:asciiTheme="majorHAnsi" w:eastAsiaTheme="majorEastAsia" w:hAnsiTheme="majorHAnsi" w:cstheme="majorBidi"/>
-          <w:b/>
-          <w:bCs/>
-          <w:sz w:val="24"/>
-          <w:szCs w:val="24"/>
-        </w:rPr>
-        <w:t>Si el paquete ya llegó, también verá su estado (Disponible, Facturado, Entregado). [CAPTURA 10: vista que ve tu cliente]</w:t>
-      </w:r>
-    </w:p>
-    <w:p>
-      <w:pPr>
-        <w:rPr>
-          <w:rFonts w:asciiTheme="majorHAnsi" w:eastAsiaTheme="majorEastAsia" w:hAnsiTheme="majorHAnsi" w:cstheme="majorBidi"/>
-          <w:color w:val="0F4761" w:themeColor="accent1" w:themeShade="BF"/>
-          <w:sz w:val="32"/>
-          <w:szCs w:val="32"/>
-        </w:rPr>
-      </w:pPr>
-      <w:r>
-        <w:rPr>
-          <w:rFonts w:asciiTheme="majorHAnsi" w:eastAsiaTheme="majorEastAsia" w:hAnsiTheme="majorHAnsi" w:cstheme="majorBidi"/>
-          <w:color w:val="0F4761" w:themeColor="accent1" w:themeShade="BF"/>
-          <w:sz w:val="32"/>
-          <w:szCs w:val="32"/>
-        </w:rPr>
-        <w:t>12. Palabras fáciles</w:t>
+          <w:b/>
+          <w:color w:val="16A34A"/>
+          <w:sz w:val="28"/>
+        </w:rPr>
+        <w:t>13. Palabras fáciles</w:t>
       </w:r>
     </w:p>
     <w:tbl>
@@ -1722,7 +1303,15 @@
             <w:tcW w:w="4419" w:type="dxa"/>
           </w:tcPr>
           <w:p>
-            <w:r>
+            <w:pPr>
+              <w:rPr>
+                <w:b/>
+              </w:rPr>
+            </w:pPr>
+            <w:r>
+              <w:rPr>
+                <w:b/>
+              </w:rPr>
               <w:t>Palabra</w:t>
             </w:r>
           </w:p>
@@ -1732,7 +1321,15 @@
             <w:tcW w:w="4419" w:type="dxa"/>
           </w:tcPr>
           <w:p>
-            <w:r>
+            <w:pPr>
+              <w:rPr>
+                <w:b/>
+              </w:rPr>
+            </w:pPr>
+            <w:r>
+              <w:rPr>
+                <w:b/>
+              </w:rPr>
               <w:t>Qué significa</w:t>
             </w:r>
           </w:p>
@@ -1919,6 +1516,7 @@
           </w:tcPr>
           <w:p>
             <w:r>
+              <w:lastRenderedPageBreak/>
               <w:t>Factura al cliente</w:t>
             </w:r>
           </w:p>
@@ -2022,21 +1620,20 @@
     <w:p/>
     <w:p>
       <w:pPr>
-        <w:rPr>
-          <w:rFonts w:asciiTheme="majorHAnsi" w:eastAsiaTheme="majorEastAsia" w:hAnsiTheme="majorHAnsi" w:cstheme="majorBidi"/>
-          <w:color w:val="0F4761" w:themeColor="accent1" w:themeShade="BF"/>
-          <w:sz w:val="32"/>
-          <w:szCs w:val="32"/>
+        <w:outlineLvl w:val="1"/>
+        <w:rPr>
+          <w:b/>
+          <w:color w:val="16A34A"/>
+          <w:sz w:val="28"/>
         </w:rPr>
       </w:pPr>
       <w:r>
         <w:rPr>
-          <w:rFonts w:asciiTheme="majorHAnsi" w:eastAsiaTheme="majorEastAsia" w:hAnsiTheme="majorHAnsi" w:cstheme="majorBidi"/>
-          <w:color w:val="0F4761" w:themeColor="accent1" w:themeShade="BF"/>
-          <w:sz w:val="32"/>
-          <w:szCs w:val="32"/>
-        </w:rPr>
-        <w:t>13. Problemas comunes y sus soluciones</w:t>
+          <w:b/>
+          <w:color w:val="16A34A"/>
+          <w:sz w:val="28"/>
+        </w:rPr>
+        <w:t>14. Problemas comunes y sus soluciones</w:t>
       </w:r>
     </w:p>
     <w:tbl>
@@ -2074,7 +1671,15 @@
             <w:tcW w:w="2946" w:type="dxa"/>
           </w:tcPr>
           <w:p>
-            <w:r>
+            <w:pPr>
+              <w:rPr>
+                <w:b/>
+              </w:rPr>
+            </w:pPr>
+            <w:r>
+              <w:rPr>
+                <w:b/>
+              </w:rPr>
               <w:t>Lo que ves</w:t>
             </w:r>
           </w:p>
@@ -2084,7 +1689,15 @@
             <w:tcW w:w="2946" w:type="dxa"/>
           </w:tcPr>
           <w:p>
-            <w:r>
+            <w:pPr>
+              <w:rPr>
+                <w:b/>
+              </w:rPr>
+            </w:pPr>
+            <w:r>
+              <w:rPr>
+                <w:b/>
+              </w:rPr>
               <w:t>Qué significa</w:t>
             </w:r>
           </w:p>
@@ -2094,7 +1707,15 @@
             <w:tcW w:w="2946" w:type="dxa"/>
           </w:tcPr>
           <w:p>
-            <w:r>
+            <w:pPr>
+              <w:rPr>
+                <w:b/>
+              </w:rPr>
+            </w:pPr>
+            <w:r>
+              <w:rPr>
+                <w:b/>
+              </w:rPr>
               <w:t>Qué haces</w:t>
             </w:r>
           </w:p>
@@ -2151,7 +1772,7 @@
           </w:tcPr>
           <w:p>
             <w:r>
-              <w:t>"Tracking duplicado"</w:t>
+              <w:t>Tracking duplicado</w:t>
             </w:r>
           </w:p>
         </w:tc>
@@ -2189,7 +1810,7 @@
           </w:tcPr>
           <w:p>
             <w:r>
-              <w:t>"El número de factura ya existe"</w:t>
+              <w:t>El número de factura ya existe</w:t>
             </w:r>
           </w:p>
         </w:tc>
@@ -2227,7 +1848,7 @@
           </w:tcPr>
           <w:p>
             <w:r>
-              <w:t>"Paquete ya facturado/entregado"</w:t>
+              <w:t>Paquete ya facturado/entregado</w:t>
             </w:r>
           </w:p>
         </w:tc>
@@ -2294,168 +1915,118 @@
     <w:p/>
     <w:p>
       <w:pPr>
-        <w:rPr>
-          <w:rFonts w:asciiTheme="majorHAnsi" w:eastAsiaTheme="majorEastAsia" w:hAnsiTheme="majorHAnsi" w:cstheme="majorBidi"/>
-          <w:color w:val="0F4761" w:themeColor="accent1" w:themeShade="BF"/>
-          <w:sz w:val="32"/>
-          <w:szCs w:val="32"/>
+        <w:outlineLvl w:val="1"/>
+        <w:rPr>
+          <w:b/>
+          <w:color w:val="16A34A"/>
+          <w:sz w:val="28"/>
         </w:rPr>
       </w:pPr>
       <w:r>
         <w:rPr>
-          <w:rFonts w:asciiTheme="majorHAnsi" w:eastAsiaTheme="majorEastAsia" w:hAnsiTheme="majorHAnsi" w:cstheme="majorBidi"/>
-          <w:color w:val="0F4761" w:themeColor="accent1" w:themeShade="BF"/>
-          <w:sz w:val="32"/>
-          <w:szCs w:val="32"/>
-        </w:rPr>
-        <w:t>14. Tu rutina diaria en 7 pasos</w:t>
-      </w:r>
-    </w:p>
-    <w:p>
-      <w:pPr>
-        <w:rPr>
-          <w:rFonts w:asciiTheme="majorHAnsi" w:eastAsiaTheme="majorEastAsia" w:hAnsiTheme="majorHAnsi" w:cstheme="majorBidi"/>
-          <w:b/>
-          <w:bCs/>
-          <w:sz w:val="24"/>
-          <w:szCs w:val="24"/>
-        </w:rPr>
-      </w:pPr>
-      <w:r>
-        <w:rPr>
-          <w:rFonts w:asciiTheme="majorHAnsi" w:eastAsiaTheme="majorEastAsia" w:hAnsiTheme="majorHAnsi" w:cstheme="majorBidi"/>
-          <w:b/>
-          <w:bCs/>
-          <w:sz w:val="24"/>
-          <w:szCs w:val="24"/>
-        </w:rPr>
-        <w:t>1. **En tránsito**: consulta el código del paquete y manda el enlace a tu cliente.</w:t>
-      </w:r>
-    </w:p>
-    <w:p>
-      <w:pPr>
-        <w:rPr>
-          <w:rFonts w:asciiTheme="majorHAnsi" w:eastAsiaTheme="majorEastAsia" w:hAnsiTheme="majorHAnsi" w:cstheme="majorBidi"/>
-          <w:b/>
-          <w:bCs/>
-          <w:sz w:val="24"/>
-          <w:szCs w:val="24"/>
-        </w:rPr>
-      </w:pPr>
-      <w:r>
-        <w:rPr>
-          <w:rFonts w:asciiTheme="majorHAnsi" w:eastAsiaTheme="majorEastAsia" w:hAnsiTheme="majorHAnsi" w:cstheme="majorBidi"/>
-          <w:b/>
-          <w:bCs/>
-          <w:sz w:val="24"/>
-          <w:szCs w:val="24"/>
-        </w:rPr>
-        <w:t>2. **Recepción de paquetes**: registra los paquetes que llegaron (a mano, rápido o Excel).</w:t>
-      </w:r>
-    </w:p>
-    <w:p>
-      <w:pPr>
-        <w:rPr>
-          <w:rFonts w:asciiTheme="majorHAnsi" w:eastAsiaTheme="majorEastAsia" w:hAnsiTheme="majorHAnsi" w:cstheme="majorBidi"/>
-          <w:b/>
-          <w:bCs/>
-          <w:sz w:val="24"/>
-          <w:szCs w:val="24"/>
-        </w:rPr>
-      </w:pPr>
-      <w:r>
-        <w:rPr>
-          <w:rFonts w:asciiTheme="majorHAnsi" w:eastAsiaTheme="majorEastAsia" w:hAnsiTheme="majorHAnsi" w:cstheme="majorBidi"/>
-          <w:b/>
-          <w:bCs/>
-          <w:sz w:val="24"/>
-          <w:szCs w:val="24"/>
-        </w:rPr>
-        <w:t>3. **Paquetes recibidos**: revisa tarifas y asigna cliente y bodega.</w:t>
-      </w:r>
-    </w:p>
-    <w:p>
-      <w:pPr>
-        <w:rPr>
-          <w:rFonts w:asciiTheme="majorHAnsi" w:eastAsiaTheme="majorEastAsia" w:hAnsiTheme="majorHAnsi" w:cstheme="majorBidi"/>
-          <w:b/>
-          <w:bCs/>
-          <w:sz w:val="24"/>
-          <w:szCs w:val="24"/>
-        </w:rPr>
-      </w:pPr>
-      <w:r>
-        <w:rPr>
-          <w:rFonts w:asciiTheme="majorHAnsi" w:eastAsiaTheme="majorEastAsia" w:hAnsiTheme="majorHAnsi" w:cstheme="majorBidi"/>
-          <w:b/>
-          <w:bCs/>
-          <w:sz w:val="24"/>
-          <w:szCs w:val="24"/>
-        </w:rPr>
-        <w:t>4. **Conciliación de compras**: une los paquetes con la compra al proveedor y emite la factura de compra.</w:t>
-      </w:r>
-    </w:p>
-    <w:p>
-      <w:pPr>
-        <w:rPr>
-          <w:rFonts w:asciiTheme="majorHAnsi" w:eastAsiaTheme="majorEastAsia" w:hAnsiTheme="majorHAnsi" w:cstheme="majorBidi"/>
-          <w:b/>
-          <w:bCs/>
-          <w:sz w:val="24"/>
-          <w:szCs w:val="24"/>
-        </w:rPr>
-      </w:pPr>
-      <w:r>
-        <w:rPr>
-          <w:rFonts w:asciiTheme="majorHAnsi" w:eastAsiaTheme="majorEastAsia" w:hAnsiTheme="majorHAnsi" w:cstheme="majorBidi"/>
-          <w:b/>
-          <w:bCs/>
-          <w:sz w:val="24"/>
-          <w:szCs w:val="24"/>
-        </w:rPr>
-        <w:t>5. **Disponibles para facturar**: cobra al cliente (tarifa por libra) y confirma la factura.</w:t>
-      </w:r>
-    </w:p>
-    <w:p>
-      <w:pPr>
-        <w:rPr>
-          <w:rFonts w:asciiTheme="majorHAnsi" w:eastAsiaTheme="majorEastAsia" w:hAnsiTheme="majorHAnsi" w:cstheme="majorBidi"/>
-          <w:b/>
-          <w:bCs/>
-          <w:sz w:val="24"/>
-          <w:szCs w:val="24"/>
-        </w:rPr>
-      </w:pPr>
-      <w:r>
-        <w:rPr>
-          <w:rFonts w:asciiTheme="majorHAnsi" w:eastAsiaTheme="majorEastAsia" w:hAnsiTheme="majorHAnsi" w:cstheme="majorBidi"/>
-          <w:b/>
-          <w:bCs/>
-          <w:sz w:val="24"/>
-          <w:szCs w:val="24"/>
-        </w:rPr>
-        <w:t>6. Si te equivocaste: **Facturación y reversiones** &gt; Anular &gt; Corregir y refacturar.</w:t>
-      </w:r>
-    </w:p>
-    <w:p>
-      <w:pPr>
-        <w:rPr>
-          <w:rFonts w:asciiTheme="majorHAnsi" w:eastAsiaTheme="majorEastAsia" w:hAnsiTheme="majorHAnsi" w:cstheme="majorBidi"/>
-          <w:b/>
-          <w:bCs/>
-          <w:sz w:val="24"/>
-          <w:szCs w:val="24"/>
-        </w:rPr>
-      </w:pPr>
-      <w:r>
-        <w:rPr>
-          <w:rFonts w:asciiTheme="majorHAnsi" w:eastAsiaTheme="majorEastAsia" w:hAnsiTheme="majorHAnsi" w:cstheme="majorBidi"/>
-          <w:b/>
-          <w:bCs/>
-          <w:sz w:val="24"/>
-          <w:szCs w:val="24"/>
-        </w:rPr>
-        <w:t>7. **Entrega**: cuando el cliente recoge, marca el paquete como entregado.</w:t>
+          <w:b/>
+          <w:color w:val="16A34A"/>
+          <w:sz w:val="28"/>
+        </w:rPr>
+        <w:t>15. Tu rutina diaria en 7 pasos</w:t>
+      </w:r>
+    </w:p>
+    <w:p>
+      <w:r>
+        <w:t xml:space="preserve">• 1. </w:t>
+      </w:r>
+      <w:r>
+        <w:rPr>
+          <w:b/>
+        </w:rPr>
+        <w:t>En tránsito</w:t>
+      </w:r>
+      <w:r>
+        <w:t>: consulta el código del paquete y manda el enlace a tu cliente.</w:t>
+      </w:r>
+    </w:p>
+    <w:p>
+      <w:r>
+        <w:t xml:space="preserve">• 2. </w:t>
+      </w:r>
+      <w:r>
+        <w:rPr>
+          <w:b/>
+        </w:rPr>
+        <w:t>Recepción de paquetes</w:t>
+      </w:r>
+      <w:r>
+        <w:t>: registra los paquetes que llegaron (a mano, rápido o Excel).</w:t>
+      </w:r>
+    </w:p>
+    <w:p>
+      <w:r>
+        <w:t xml:space="preserve">• 3. </w:t>
+      </w:r>
+      <w:r>
+        <w:rPr>
+          <w:b/>
+        </w:rPr>
+        <w:t>Paquetes recibidos</w:t>
+      </w:r>
+      <w:r>
+        <w:t>: revisa tarifas y asigna cliente y bodega.</w:t>
+      </w:r>
+    </w:p>
+    <w:p>
+      <w:r>
+        <w:t xml:space="preserve">• 4. </w:t>
+      </w:r>
+      <w:r>
+        <w:rPr>
+          <w:b/>
+        </w:rPr>
+        <w:t>Conciliación de compras</w:t>
+      </w:r>
+      <w:r>
+        <w:t>: une los paquetes con la compra al proveedor y emite la factura de compra.</w:t>
+      </w:r>
+    </w:p>
+    <w:p>
+      <w:r>
+        <w:t xml:space="preserve">• 5. </w:t>
+      </w:r>
+      <w:r>
+        <w:rPr>
+          <w:b/>
+        </w:rPr>
+        <w:t>Disponibles para facturar</w:t>
+      </w:r>
+      <w:r>
+        <w:t>: cobra al cliente (tarifa por libra) y confirma la factura.</w:t>
+      </w:r>
+    </w:p>
+    <w:p>
+      <w:r>
+        <w:t xml:space="preserve">• 6. Si te equivocaste: </w:t>
+      </w:r>
+      <w:r>
+        <w:rPr>
+          <w:b/>
+        </w:rPr>
+        <w:t>Facturación y reversiones</w:t>
+      </w:r>
+      <w:r>
+        <w:t xml:space="preserve"> &gt; Anular &gt; Corregir y refacturar.</w:t>
+      </w:r>
+    </w:p>
+    <w:p>
+      <w:r>
+        <w:t xml:space="preserve">• 7. </w:t>
+      </w:r>
+      <w:r>
+        <w:rPr>
+          <w:b/>
+        </w:rPr>
+        <w:t>Entrega</w:t>
+      </w:r>
+      <w:r>
+        <w:t>: cuando el cliente recoge, marca el paquete como entregado.</w:t>
       </w:r>
     </w:p>
     <w:p/>
@@ -2881,7 +2452,7 @@
     <w:link w:val="Ttulo1Car"/>
     <w:uiPriority w:val="9"/>
     <w:qFormat/>
-    <w:rsid w:val="005E15BE"/>
+    <w:rsid w:val="00F07FFD"/>
     <w:pPr>
       <w:keepNext/>
       <w:keepLines/>
@@ -2901,9 +2472,10 @@
     <w:next w:val="Normal"/>
     <w:link w:val="Ttulo2Car"/>
     <w:uiPriority w:val="9"/>
+    <w:semiHidden/>
     <w:unhideWhenUsed/>
     <w:qFormat/>
-    <w:rsid w:val="005E15BE"/>
+    <w:rsid w:val="00F07FFD"/>
     <w:pPr>
       <w:keepNext/>
       <w:keepLines/>
@@ -2926,7 +2498,7 @@
     <w:semiHidden/>
     <w:unhideWhenUsed/>
     <w:qFormat/>
-    <w:rsid w:val="005E15BE"/>
+    <w:rsid w:val="00F07FFD"/>
     <w:pPr>
       <w:keepNext/>
       <w:keepLines/>
@@ -2949,7 +2521,7 @@
     <w:semiHidden/>
     <w:unhideWhenUsed/>
     <w:qFormat/>
-    <w:rsid w:val="005E15BE"/>
+    <w:rsid w:val="00F07FFD"/>
     <w:pPr>
       <w:keepNext/>
       <w:keepLines/>
@@ -2972,7 +2544,7 @@
     <w:semiHidden/>
     <w:unhideWhenUsed/>
     <w:qFormat/>
-    <w:rsid w:val="005E15BE"/>
+    <w:rsid w:val="00F07FFD"/>
     <w:pPr>
       <w:keepNext/>
       <w:keepLines/>
@@ -2993,7 +2565,7 @@
     <w:semiHidden/>
     <w:unhideWhenUsed/>
     <w:qFormat/>
-    <w:rsid w:val="005E15BE"/>
+    <w:rsid w:val="00F07FFD"/>
     <w:pPr>
       <w:keepNext/>
       <w:keepLines/>
@@ -3016,7 +2588,7 @@
     <w:semiHidden/>
     <w:unhideWhenUsed/>
     <w:qFormat/>
-    <w:rsid w:val="005E15BE"/>
+    <w:rsid w:val="00F07FFD"/>
     <w:pPr>
       <w:keepNext/>
       <w:keepLines/>
@@ -3037,7 +2609,7 @@
     <w:semiHidden/>
     <w:unhideWhenUsed/>
     <w:qFormat/>
-    <w:rsid w:val="005E15BE"/>
+    <w:rsid w:val="00F07FFD"/>
     <w:pPr>
       <w:keepNext/>
       <w:keepLines/>
@@ -3060,7 +2632,7 @@
     <w:semiHidden/>
     <w:unhideWhenUsed/>
     <w:qFormat/>
-    <w:rsid w:val="005E15BE"/>
+    <w:rsid w:val="00F07FFD"/>
     <w:pPr>
       <w:keepNext/>
       <w:keepLines/>
@@ -3104,7 +2676,7 @@
     <w:basedOn w:val="Fuentedeprrafopredeter"/>
     <w:link w:val="Ttulo1"/>
     <w:uiPriority w:val="9"/>
-    <w:rsid w:val="005E15BE"/>
+    <w:rsid w:val="00F07FFD"/>
     <w:rPr>
       <w:rFonts w:asciiTheme="majorHAnsi" w:eastAsiaTheme="majorEastAsia" w:hAnsiTheme="majorHAnsi" w:cstheme="majorBidi"/>
       <w:color w:val="0F4761" w:themeColor="accent1" w:themeShade="BF"/>
@@ -3117,7 +2689,8 @@
     <w:basedOn w:val="Fuentedeprrafopredeter"/>
     <w:link w:val="Ttulo2"/>
     <w:uiPriority w:val="9"/>
-    <w:rsid w:val="005E15BE"/>
+    <w:semiHidden/>
+    <w:rsid w:val="00F07FFD"/>
     <w:rPr>
       <w:rFonts w:asciiTheme="majorHAnsi" w:eastAsiaTheme="majorEastAsia" w:hAnsiTheme="majorHAnsi" w:cstheme="majorBidi"/>
       <w:color w:val="0F4761" w:themeColor="accent1" w:themeShade="BF"/>
@@ -3131,7 +2704,7 @@
     <w:link w:val="Ttulo3"/>
     <w:uiPriority w:val="9"/>
     <w:semiHidden/>
-    <w:rsid w:val="005E15BE"/>
+    <w:rsid w:val="00F07FFD"/>
     <w:rPr>
       <w:rFonts w:eastAsiaTheme="majorEastAsia" w:cstheme="majorBidi"/>
       <w:color w:val="0F4761" w:themeColor="accent1" w:themeShade="BF"/>
@@ -3145,7 +2718,7 @@
     <w:link w:val="Ttulo4"/>
     <w:uiPriority w:val="9"/>
     <w:semiHidden/>
-    <w:rsid w:val="005E15BE"/>
+    <w:rsid w:val="00F07FFD"/>
     <w:rPr>
       <w:rFonts w:eastAsiaTheme="majorEastAsia" w:cstheme="majorBidi"/>
       <w:i/>
@@ -3159,7 +2732,7 @@
     <w:link w:val="Ttulo5"/>
     <w:uiPriority w:val="9"/>
     <w:semiHidden/>
-    <w:rsid w:val="005E15BE"/>
+    <w:rsid w:val="00F07FFD"/>
     <w:rPr>
       <w:rFonts w:eastAsiaTheme="majorEastAsia" w:cstheme="majorBidi"/>
       <w:color w:val="0F4761" w:themeColor="accent1" w:themeShade="BF"/>
@@ -3171,7 +2744,7 @@
     <w:link w:val="Ttulo6"/>
     <w:uiPriority w:val="9"/>
     <w:semiHidden/>
-    <w:rsid w:val="005E15BE"/>
+    <w:rsid w:val="00F07FFD"/>
     <w:rPr>
       <w:rFonts w:eastAsiaTheme="majorEastAsia" w:cstheme="majorBidi"/>
       <w:i/>
@@ -3185,7 +2758,7 @@
     <w:link w:val="Ttulo7"/>
     <w:uiPriority w:val="9"/>
     <w:semiHidden/>
-    <w:rsid w:val="005E15BE"/>
+    <w:rsid w:val="00F07FFD"/>
     <w:rPr>
       <w:rFonts w:eastAsiaTheme="majorEastAsia" w:cstheme="majorBidi"/>
       <w:color w:val="595959" w:themeColor="text1" w:themeTint="A6"/>
@@ -3197,7 +2770,7 @@
     <w:link w:val="Ttulo8"/>
     <w:uiPriority w:val="9"/>
     <w:semiHidden/>
-    <w:rsid w:val="005E15BE"/>
+    <w:rsid w:val="00F07FFD"/>
     <w:rPr>
       <w:rFonts w:eastAsiaTheme="majorEastAsia" w:cstheme="majorBidi"/>
       <w:i/>
@@ -3211,7 +2784,7 @@
     <w:link w:val="Ttulo9"/>
     <w:uiPriority w:val="9"/>
     <w:semiHidden/>
-    <w:rsid w:val="005E15BE"/>
+    <w:rsid w:val="00F07FFD"/>
     <w:rPr>
       <w:rFonts w:eastAsiaTheme="majorEastAsia" w:cstheme="majorBidi"/>
       <w:color w:val="272727" w:themeColor="text1" w:themeTint="D8"/>
@@ -3224,7 +2797,7 @@
     <w:link w:val="TtuloCar"/>
     <w:uiPriority w:val="10"/>
     <w:qFormat/>
-    <w:rsid w:val="005E15BE"/>
+    <w:rsid w:val="00F07FFD"/>
     <w:pPr>
       <w:spacing w:after="80" w:line="240" w:lineRule="auto"/>
       <w:contextualSpacing/>
@@ -3242,7 +2815,7 @@
     <w:basedOn w:val="Fuentedeprrafopredeter"/>
     <w:link w:val="Ttulo"/>
     <w:uiPriority w:val="10"/>
-    <w:rsid w:val="005E15BE"/>
+    <w:rsid w:val="00F07FFD"/>
     <w:rPr>
       <w:rFonts w:asciiTheme="majorHAnsi" w:eastAsiaTheme="majorEastAsia" w:hAnsiTheme="majorHAnsi" w:cstheme="majorBidi"/>
       <w:spacing w:val="-10"/>
@@ -3258,7 +2831,7 @@
     <w:link w:val="SubttuloCar"/>
     <w:uiPriority w:val="11"/>
     <w:qFormat/>
-    <w:rsid w:val="005E15BE"/>
+    <w:rsid w:val="00F07FFD"/>
     <w:pPr>
       <w:numPr>
         <w:ilvl w:val="1"/>
@@ -3277,7 +2850,7 @@
     <w:basedOn w:val="Fuentedeprrafopredeter"/>
     <w:link w:val="Subttulo"/>
     <w:uiPriority w:val="11"/>
-    <w:rsid w:val="005E15BE"/>
+    <w:rsid w:val="00F07FFD"/>
     <w:rPr>
       <w:rFonts w:eastAsiaTheme="majorEastAsia" w:cstheme="majorBidi"/>
       <w:color w:val="595959" w:themeColor="text1" w:themeTint="A6"/>
@@ -3293,7 +2866,7 @@
     <w:link w:val="CitaCar"/>
     <w:uiPriority w:val="29"/>
     <w:qFormat/>
-    <w:rsid w:val="005E15BE"/>
+    <w:rsid w:val="00F07FFD"/>
     <w:pPr>
       <w:spacing w:before="160"/>
       <w:jc w:val="center"/>
@@ -3309,7 +2882,7 @@
     <w:basedOn w:val="Fuentedeprrafopredeter"/>
     <w:link w:val="Cita"/>
     <w:uiPriority w:val="29"/>
-    <w:rsid w:val="005E15BE"/>
+    <w:rsid w:val="00F07FFD"/>
     <w:rPr>
       <w:i/>
       <w:iCs/>
@@ -3321,7 +2894,7 @@
     <w:basedOn w:val="Normal"/>
     <w:uiPriority w:val="34"/>
     <w:qFormat/>
-    <w:rsid w:val="005E15BE"/>
+    <w:rsid w:val="00F07FFD"/>
     <w:pPr>
       <w:ind w:left="720"/>
       <w:contextualSpacing/>
@@ -3332,7 +2905,7 @@
     <w:basedOn w:val="Fuentedeprrafopredeter"/>
     <w:uiPriority w:val="21"/>
     <w:qFormat/>
-    <w:rsid w:val="005E15BE"/>
+    <w:rsid w:val="00F07FFD"/>
     <w:rPr>
       <w:i/>
       <w:iCs/>
@@ -3346,7 +2919,7 @@
     <w:link w:val="CitadestacadaCar"/>
     <w:uiPriority w:val="30"/>
     <w:qFormat/>
-    <w:rsid w:val="005E15BE"/>
+    <w:rsid w:val="00F07FFD"/>
     <w:pPr>
       <w:pBdr>
         <w:top w:val="single" w:sz="4" w:space="10" w:color="0F4761" w:themeColor="accent1" w:themeShade="BF"/>
@@ -3367,7 +2940,7 @@
     <w:basedOn w:val="Fuentedeprrafopredeter"/>
     <w:link w:val="Citadestacada"/>
     <w:uiPriority w:val="30"/>
-    <w:rsid w:val="005E15BE"/>
+    <w:rsid w:val="00F07FFD"/>
     <w:rPr>
       <w:i/>
       <w:iCs/>
@@ -3379,31 +2952,13 @@
     <w:basedOn w:val="Fuentedeprrafopredeter"/>
     <w:uiPriority w:val="32"/>
     <w:qFormat/>
-    <w:rsid w:val="005E15BE"/>
+    <w:rsid w:val="00F07FFD"/>
     <w:rPr>
       <w:b/>
       <w:bCs/>
       <w:smallCaps/>
       <w:color w:val="0F4761" w:themeColor="accent1" w:themeShade="BF"/>
       <w:spacing w:val="5"/>
-    </w:rPr>
-  </w:style>
-  <w:style w:type="paragraph" w:styleId="Encabezadodelista">
-    <w:name w:val="toa heading"/>
-    <w:basedOn w:val="Normal"/>
-    <w:next w:val="Normal"/>
-    <w:uiPriority w:val="99"/>
-    <w:unhideWhenUsed/>
-    <w:rsid w:val="005E15BE"/>
-    <w:pPr>
-      <w:spacing w:before="120"/>
-    </w:pPr>
-    <w:rPr>
-      <w:rFonts w:asciiTheme="majorHAnsi" w:eastAsiaTheme="majorEastAsia" w:hAnsiTheme="majorHAnsi" w:cstheme="majorBidi"/>
-      <w:b/>
-      <w:bCs/>
-      <w:sz w:val="24"/>
-      <w:szCs w:val="24"/>
     </w:rPr>
   </w:style>
 </w:styles>

</xml_diff>